<commit_message>
fix: prevent native seek barrier deadlocks
</commit_message>
<xml_diff>
--- a/docs/artifacts/SyncYourJoy-Gates-1-3-Test-Guide.docx
+++ b/docs/artifacts/SyncYourJoy-Gates-1-3-Test-Guide.docx
@@ -111,7 +111,7 @@
                 <w:sz w:val="17"/>
                 <w:szCs w:val="17"/>
               </w:rPr>
-              <w:t xml:space="preserve">SyncYourJoy 0.1.19 beta</w:t>
+              <w:t xml:space="preserve">SyncYourJoy 0.1.20 beta</w:t>
             </w:r>
           </w:p>
         </w:tc>
@@ -393,7 +393,7 @@
           <w:sz w:val="19"/>
           <w:szCs w:val="19"/>
         </w:rPr>
-        <w:t xml:space="preserve">The same SyncYourJoy 0.1.19 release installed on every computer.</w:t>
+        <w:t xml:space="preserve">The same SyncYourJoy 0.1.20 release installed on every computer.</w:t>
       </w:r>
     </w:p>
     <w:p>
@@ -573,7 +573,7 @@
         </w:rPr>
         <w:t xml:space="preserve">Release ZIP: </w:t>
       </w:r>
-      <w:hyperlink w:history="1" r:id="rIdhpfzij4rw9ts8yf-stkru">
+      <w:hyperlink w:history="1" r:id="rIdzdlzvjz4vsd__16cvzqmr">
         <w:r>
           <w:rPr>
             <w:color w:val="0563C1"/>

</xml_diff>

<commit_message>
fix: unblock all controller seek paths
</commit_message>
<xml_diff>
--- a/docs/artifacts/SyncYourJoy-Gates-1-3-Test-Guide.docx
+++ b/docs/artifacts/SyncYourJoy-Gates-1-3-Test-Guide.docx
@@ -111,7 +111,7 @@
                 <w:sz w:val="17"/>
                 <w:szCs w:val="17"/>
               </w:rPr>
-              <w:t xml:space="preserve">SyncYourJoy 0.1.20 beta</w:t>
+              <w:t xml:space="preserve">SyncYourJoy 0.1.21 beta</w:t>
             </w:r>
           </w:p>
         </w:tc>
@@ -393,7 +393,7 @@
           <w:sz w:val="19"/>
           <w:szCs w:val="19"/>
         </w:rPr>
-        <w:t xml:space="preserve">The same SyncYourJoy 0.1.20 release installed on every computer.</w:t>
+        <w:t xml:space="preserve">The same SyncYourJoy 0.1.21 release installed on every computer.</w:t>
       </w:r>
     </w:p>
     <w:p>
@@ -573,7 +573,7 @@
         </w:rPr>
         <w:t xml:space="preserve">Release ZIP: </w:t>
       </w:r>
-      <w:hyperlink w:history="1" r:id="rIdzdlzvjz4vsd__16cvzqmr">
+      <w:hyperlink w:history="1" r:id="rIdnojxbpkmka7jvr01bdkti">
         <w:r>
           <w:rPr>
             <w:color w:val="0563C1"/>

</xml_diff>

<commit_message>
fix: harden synchronization and release packaging
Bounds diagnostics transport, protects participant reconnects, normalizes media identity URLs, hardens room admission and lifetime, and updates release verification for the 0.1.22 beta.
</commit_message>
<xml_diff>
--- a/docs/artifacts/SyncYourJoy-Gates-1-3-Test-Guide.docx
+++ b/docs/artifacts/SyncYourJoy-Gates-1-3-Test-Guide.docx
@@ -111,7 +111,7 @@
                 <w:sz w:val="17"/>
                 <w:szCs w:val="17"/>
               </w:rPr>
-              <w:t xml:space="preserve">SyncYourJoy 0.1.21 beta</w:t>
+              <w:t xml:space="preserve">SyncYourJoy 0.1.22 beta</w:t>
             </w:r>
           </w:p>
         </w:tc>
@@ -393,7 +393,7 @@
           <w:sz w:val="19"/>
           <w:szCs w:val="19"/>
         </w:rPr>
-        <w:t xml:space="preserve">The same SyncYourJoy 0.1.21 release installed on every computer.</w:t>
+        <w:t xml:space="preserve">The same SyncYourJoy 0.1.22 release installed on every computer.</w:t>
       </w:r>
     </w:p>
     <w:p>
@@ -573,7 +573,7 @@
         </w:rPr>
         <w:t xml:space="preserve">Release ZIP: </w:t>
       </w:r>
-      <w:hyperlink w:history="1" r:id="rIdnojxbpkmka7jvr01bdkti">
+      <w:hyperlink w:history="1" r:id="rIdesat102_vfqiyhshfxerq">
         <w:r>
           <w:rPr>
             <w:color w:val="0563C1"/>

</xml_diff>

<commit_message>
docs: refresh friend testing guide
Document the deployed 0.1.22 coordinator, require real video-progress checks, and add provider and recovery coverage for friend testing.
</commit_message>
<xml_diff>
--- a/docs/artifacts/SyncYourJoy-Gates-1-3-Test-Guide.docx
+++ b/docs/artifacts/SyncYourJoy-Gates-1-3-Test-Guide.docx
@@ -315,7 +315,7 @@
           <w:sz w:val="20"/>
           <w:szCs w:val="20"/>
         </w:rPr>
-        <w:t xml:space="preserve">This guide closes the real-device evidence still required for Gates 1-3. It is for two or more people using separate devices and separate authorized streaming accounts.</w:t>
+        <w:t xml:space="preserve">This guide closes the real-device evidence still required for Gates 1-3 after the production coordinator deployment. It is for two or more people using separate devices and separate authorized streaming accounts.</w:t>
       </w:r>
     </w:p>
     <w:p>
@@ -335,6 +335,21 @@
     </w:p>
     <w:p>
       <w:pPr>
+        <w:spacing w:after="100"/>
+      </w:pPr>
+      <w:r>
+        <w:rPr>
+          <w:b w:val="false"/>
+          <w:bCs w:val="false"/>
+          <w:color w:val="52656D"/>
+          <w:sz w:val="20"/>
+          <w:szCs w:val="20"/>
+        </w:rPr>
+        <w:t xml:space="preserve">The side panel can report an aligned timeline even when a provider has stopped progressing its real video element. Every pass decision must check the visible video and its native current time, not only the room label.</w:t>
+      </w:r>
+    </w:p>
+    <w:p>
+      <w:pPr>
         <w:pStyle w:val="Heading1"/>
         <w:spacing w:after="100" w:before="180"/>
       </w:pPr>
@@ -427,6 +442,23 @@
           <w:sz w:val="19"/>
           <w:szCs w:val="19"/>
         </w:rPr>
+        <w:t xml:space="preserve">A way to record the visible video time on both devices, for example from native controls or a paused timestamp.</w:t>
+      </w:r>
+    </w:p>
+    <w:p>
+      <w:pPr>
+        <w:pStyle w:val="ListParagraph"/>
+        <w:numPr>
+          <w:ilvl w:val="0"/>
+          <w:numId w:val="2"/>
+        </w:numPr>
+        <w:spacing w:after="45"/>
+      </w:pPr>
+      <w:r>
+        <w:rPr>
+          <w:sz w:val="19"/>
+          <w:szCs w:val="19"/>
+        </w:rPr>
         <w:t xml:space="preserve">One short, known video for the first run. Avoid live streams and pages with many unrelated videos at first.</w:t>
       </w:r>
     </w:p>
@@ -563,6 +595,65 @@
     </w:p>
     <w:p>
       <w:pPr>
+        <w:pStyle w:val="Heading1"/>
+        <w:spacing w:after="100" w:before="180"/>
+      </w:pPr>
+      <w:r>
+        <w:rPr>
+          <w:color w:val="0F766E"/>
+        </w:rPr>
+        <w:t xml:space="preserve">3. Production preflight</w:t>
+      </w:r>
+    </w:p>
+    <w:p>
+      <w:pPr>
+        <w:spacing w:after="100"/>
+      </w:pPr>
+      <w:r>
+        <w:rPr>
+          <w:b w:val="false"/>
+          <w:bCs w:val="false"/>
+          <w:color w:val="24353A"/>
+          <w:sz w:val="20"/>
+          <w:szCs w:val="20"/>
+        </w:rPr>
+        <w:t xml:space="preserve">The maintainer has deployed the room coordinator and passed the production smoke test. If the coordinator is redeployed before a test session, run these commands from the repository directory, not from ~:</w:t>
+      </w:r>
+    </w:p>
+    <w:p>
+      <w:pPr>
+        <w:spacing w:after="100"/>
+      </w:pPr>
+      <w:r>
+        <w:rPr>
+          <w:b w:val="false"/>
+          <w:bCs w:val="false"/>
+          <w:color w:val="16303A"/>
+          <w:sz w:val="20"/>
+          <w:szCs w:val="20"/>
+        </w:rPr>
+        <w:t xml:space="preserve">cd /Users/muazsabbagh/Codex/Projects/SyncYourJoy
+npm run deploy:edge
+npm run smoke:edge -- wss://sync-your-joy-rooms.sync-your-joy.workers.dev/rooms</w:t>
+      </w:r>
+    </w:p>
+    <w:p>
+      <w:pPr>
+        <w:spacing w:after="100"/>
+      </w:pPr>
+      <w:r>
+        <w:rPr>
+          <w:b w:val="false"/>
+          <w:bCs w:val="false"/>
+          <w:color w:val="52656D"/>
+          <w:sz w:val="20"/>
+          <w:szCs w:val="20"/>
+        </w:rPr>
+        <w:t xml:space="preserve">Participants do not need Node.js, Wrangler, or a Cloudflare account. They only need the published extension ZIP.</w:t>
+      </w:r>
+    </w:p>
+    <w:p>
+      <w:pPr>
         <w:spacing w:after="120"/>
       </w:pPr>
       <w:r>
@@ -573,7 +664,7 @@
         </w:rPr>
         <w:t xml:space="preserve">Release ZIP: </w:t>
       </w:r>
-      <w:hyperlink w:history="1" r:id="rIdesat102_vfqiyhshfxerq">
+      <w:hyperlink w:history="1" r:id="rIdwtgzlraghgt5_yiwntqbl">
         <w:r>
           <w:rPr>
             <w:color w:val="0563C1"/>
@@ -581,7 +672,7 @@
             <w:szCs w:val="19"/>
             <w:u w:val="single"/>
           </w:rPr>
-          <w:t xml:space="preserve">https://github.com/muaz978/sync-your-joy/releases/latest/download/sync-your-joy-extension.zip</w:t>
+          <w:t xml:space="preserve">https://github.com/muaz978/sync-your-joy/releases/download/v0.1.22/sync-your-joy-extension.zip</w:t>
         </w:r>
       </w:hyperlink>
     </w:p>
@@ -594,7 +685,7 @@
         <w:rPr>
           <w:color w:val="0F766E"/>
         </w:rPr>
-        <w:t xml:space="preserve">3. Create and join a room</w:t>
+        <w:t xml:space="preserve">4. Create and join a room</w:t>
       </w:r>
     </w:p>
     <w:p>
@@ -662,24 +753,24 @@
           <w:sz w:val="19"/>
           <w:szCs w:val="19"/>
         </w:rPr>
-        <w:t xml:space="preserve">The host may enter the page URL under Video page link and select Open link for everyone.</w:t>
-      </w:r>
-    </w:p>
-    <w:p>
-      <w:pPr>
-        <w:pStyle w:val="ListParagraph"/>
-        <w:numPr>
-          <w:ilvl w:val="0"/>
-          <w:numId w:val="3"/>
-        </w:numPr>
-        <w:spacing w:after="45"/>
-      </w:pPr>
-      <w:r>
-        <w:rPr>
-          <w:sz w:val="19"/>
-          <w:szCs w:val="19"/>
-        </w:rPr>
-        <w:t xml:space="preserve">Wait for both sides to show the intended player and Video matches.</w:t>
+        <w:t xml:space="preserve">The host enters the page URL under Video page link and selects Open link for everyone. Guests do not paste a video URL. If a new tab is blocked, allow popups for the current page and retry once.</w:t>
+      </w:r>
+    </w:p>
+    <w:p>
+      <w:pPr>
+        <w:pStyle w:val="ListParagraph"/>
+        <w:numPr>
+          <w:ilvl w:val="0"/>
+          <w:numId w:val="3"/>
+        </w:numPr>
+        <w:spacing w:after="45"/>
+      </w:pPr>
+      <w:r>
+        <w:rPr>
+          <w:sz w:val="19"/>
+          <w:szCs w:val="19"/>
+        </w:rPr>
+        <w:t xml:space="preserve">Wait for each side to show the intended player, a moving or controllable native timeline, and Video matches.</w:t>
       </w:r>
     </w:p>
     <w:p>
@@ -713,7 +804,24 @@
           <w:sz w:val="19"/>
           <w:szCs w:val="19"/>
         </w:rPr>
-        <w:t xml:space="preserve">Confirm that both participants show Ready before testing playback.</w:t>
+        <w:t xml:space="preserve">Confirm that every participant sees the ready button, both participants show Ready, and readiness does not disappear during ordinary playback.</w:t>
+      </w:r>
+    </w:p>
+    <w:p>
+      <w:pPr>
+        <w:pStyle w:val="ListParagraph"/>
+        <w:numPr>
+          <w:ilvl w:val="0"/>
+          <w:numId w:val="3"/>
+        </w:numPr>
+        <w:spacing w:after="45"/>
+      </w:pPr>
+      <w:r>
+        <w:rPr>
+          <w:sz w:val="19"/>
+          <w:szCs w:val="19"/>
+        </w:rPr>
+        <w:t xml:space="preserve">Keep the side panel open for status. Hide the mini controller if it covers subtitles or player controls.</w:t>
       </w:r>
     </w:p>
     <w:p>
@@ -725,7 +833,7 @@
         <w:rPr>
           <w:color w:val="0F766E"/>
         </w:rPr>
-        <w:t xml:space="preserve">4. Test A - automatic play and pause</w:t>
+        <w:t xml:space="preserve">5. Test A - automatic play and pause</w:t>
       </w:r>
     </w:p>
     <w:p>
@@ -842,7 +950,7 @@
           <w:sz w:val="19"/>
           <w:szCs w:val="19"/>
         </w:rPr>
-        <w:t xml:space="preserve">Pass criteria: Pass when every participant follows the host and the room does not advance while a participant is visibly stopped. Record perceived delay and any stopped, buffering, or autoplay-blocked state.</w:t>
+        <w:t xml:space="preserve">Pass criteria: Pass when every participant real video starts and stops, not merely the room timeline. Record visible video time on both devices, perceived delay, and any stopped, buffering, or autoplay-blocked state.</w:t>
       </w:r>
     </w:p>
     <w:p>
@@ -854,126 +962,126 @@
         <w:rPr>
           <w:color w:val="0F766E"/>
         </w:rPr>
-        <w:t xml:space="preserve">5. Test B - forward and backward seeking</w:t>
-      </w:r>
-    </w:p>
-    <w:p>
-      <w:pPr>
-        <w:pStyle w:val="ListParagraph"/>
-        <w:numPr>
-          <w:ilvl w:val="0"/>
-          <w:numId w:val="3"/>
-        </w:numPr>
-        <w:spacing w:after="45"/>
-      </w:pPr>
-      <w:r>
-        <w:rPr>
-          <w:sz w:val="19"/>
-          <w:szCs w:val="19"/>
-        </w:rPr>
-        <w:t xml:space="preserve">Start playback and drag the host progress bar forward by about 30 seconds.</w:t>
-      </w:r>
-    </w:p>
-    <w:p>
-      <w:pPr>
-        <w:pStyle w:val="ListParagraph"/>
-        <w:numPr>
-          <w:ilvl w:val="0"/>
-          <w:numId w:val="3"/>
-        </w:numPr>
-        <w:spacing w:after="45"/>
-      </w:pPr>
-      <w:r>
-        <w:rPr>
-          <w:sz w:val="19"/>
-          <w:szCs w:val="19"/>
-        </w:rPr>
-        <w:t xml:space="preserve">Wait for the side panel alignment barrier to complete.</w:t>
-      </w:r>
-    </w:p>
-    <w:p>
-      <w:pPr>
-        <w:pStyle w:val="ListParagraph"/>
-        <w:numPr>
-          <w:ilvl w:val="0"/>
-          <w:numId w:val="3"/>
-        </w:numPr>
-        <w:spacing w:after="45"/>
-      </w:pPr>
-      <w:r>
-        <w:rPr>
-          <w:sz w:val="19"/>
-          <w:szCs w:val="19"/>
-        </w:rPr>
-        <w:t xml:space="preserve">Confirm both videos resume at the same position.</w:t>
-      </w:r>
-    </w:p>
-    <w:p>
-      <w:pPr>
-        <w:pStyle w:val="ListParagraph"/>
-        <w:numPr>
-          <w:ilvl w:val="0"/>
-          <w:numId w:val="3"/>
-        </w:numPr>
-        <w:spacing w:after="45"/>
-      </w:pPr>
-      <w:r>
-        <w:rPr>
-          <w:sz w:val="19"/>
-          <w:szCs w:val="19"/>
-        </w:rPr>
-        <w:t xml:space="preserve">Repeat with a backward seek of about 30 seconds.</w:t>
-      </w:r>
-    </w:p>
-    <w:p>
-      <w:pPr>
-        <w:pStyle w:val="ListParagraph"/>
-        <w:numPr>
-          <w:ilvl w:val="0"/>
-          <w:numId w:val="3"/>
-        </w:numPr>
-        <w:spacing w:after="45"/>
-      </w:pPr>
-      <w:r>
-        <w:rPr>
-          <w:sz w:val="19"/>
-          <w:szCs w:val="19"/>
-        </w:rPr>
-        <w:t xml:space="preserve">Repeat with three rapid drags in different directions. The final drag must win.</w:t>
-      </w:r>
-    </w:p>
-    <w:p>
-      <w:pPr>
-        <w:pStyle w:val="ListParagraph"/>
-        <w:numPr>
-          <w:ilvl w:val="0"/>
-          <w:numId w:val="3"/>
-        </w:numPr>
-        <w:spacing w:after="45"/>
-      </w:pPr>
-      <w:r>
-        <w:rPr>
-          <w:sz w:val="19"/>
-          <w:szCs w:val="19"/>
-        </w:rPr>
-        <w:t xml:space="preserve">Repeat while the room is paused.</w:t>
-      </w:r>
-    </w:p>
-    <w:p>
-      <w:pPr>
-        <w:pStyle w:val="ListParagraph"/>
-        <w:numPr>
-          <w:ilvl w:val="0"/>
-          <w:numId w:val="3"/>
-        </w:numPr>
-        <w:spacing w:after="45"/>
-      </w:pPr>
-      <w:r>
-        <w:rPr>
-          <w:sz w:val="19"/>
-          <w:szCs w:val="19"/>
-        </w:rPr>
-        <w:t xml:space="preserve">Use Sync everyone once and confirm the room remains at the displayed position.</w:t>
+        <w:t xml:space="preserve">6. Test B - forward and backward seeking</w:t>
+      </w:r>
+    </w:p>
+    <w:p>
+      <w:pPr>
+        <w:pStyle w:val="ListParagraph"/>
+        <w:numPr>
+          <w:ilvl w:val="0"/>
+          <w:numId w:val="3"/>
+        </w:numPr>
+        <w:spacing w:after="45"/>
+      </w:pPr>
+      <w:r>
+        <w:rPr>
+          <w:sz w:val="19"/>
+          <w:szCs w:val="19"/>
+        </w:rPr>
+        <w:t xml:space="preserve">Start playback and drag the host progress bar forward by about 30 seconds. Do not refresh either page.</w:t>
+      </w:r>
+    </w:p>
+    <w:p>
+      <w:pPr>
+        <w:pStyle w:val="ListParagraph"/>
+        <w:numPr>
+          <w:ilvl w:val="0"/>
+          <w:numId w:val="3"/>
+        </w:numPr>
+        <w:spacing w:after="45"/>
+      </w:pPr>
+      <w:r>
+        <w:rPr>
+          <w:sz w:val="19"/>
+          <w:szCs w:val="19"/>
+        </w:rPr>
+        <w:t xml:space="preserve">Confirm both native video elements reach the target, not just that the side panel says aligned.</w:t>
+      </w:r>
+    </w:p>
+    <w:p>
+      <w:pPr>
+        <w:pStyle w:val="ListParagraph"/>
+        <w:numPr>
+          <w:ilvl w:val="0"/>
+          <w:numId w:val="3"/>
+        </w:numPr>
+        <w:spacing w:after="45"/>
+      </w:pPr>
+      <w:r>
+        <w:rPr>
+          <w:sz w:val="19"/>
+          <w:szCs w:val="19"/>
+        </w:rPr>
+        <w:t xml:space="preserve">Repeat with a backward seek of about 30 seconds. Wait at least five seconds and verify actual frame progress after the seek.</w:t>
+      </w:r>
+    </w:p>
+    <w:p>
+      <w:pPr>
+        <w:pStyle w:val="ListParagraph"/>
+        <w:numPr>
+          <w:ilvl w:val="0"/>
+          <w:numId w:val="3"/>
+        </w:numPr>
+        <w:spacing w:after="45"/>
+      </w:pPr>
+      <w:r>
+        <w:rPr>
+          <w:sz w:val="19"/>
+          <w:szCs w:val="19"/>
+        </w:rPr>
+        <w:t xml:space="preserve">Repeat with three rapid drags in different directions. The final drag must win on both real timelines.</w:t>
+      </w:r>
+    </w:p>
+    <w:p>
+      <w:pPr>
+        <w:pStyle w:val="ListParagraph"/>
+        <w:numPr>
+          <w:ilvl w:val="0"/>
+          <w:numId w:val="3"/>
+        </w:numPr>
+        <w:spacing w:after="45"/>
+      </w:pPr>
+      <w:r>
+        <w:rPr>
+          <w:sz w:val="19"/>
+          <w:szCs w:val="19"/>
+        </w:rPr>
+        <w:t xml:space="preserve">Repeat while the room is paused, then press play once from the host.</w:t>
+      </w:r>
+    </w:p>
+    <w:p>
+      <w:pPr>
+        <w:pStyle w:val="ListParagraph"/>
+        <w:numPr>
+          <w:ilvl w:val="0"/>
+          <w:numId w:val="3"/>
+        </w:numPr>
+        <w:spacing w:after="45"/>
+      </w:pPr>
+      <w:r>
+        <w:rPr>
+          <w:sz w:val="19"/>
+          <w:szCs w:val="19"/>
+        </w:rPr>
+        <w:t xml:space="preserve">Select Sync everyone once. Verify that both videos jump to the displayed position and continue progressing.</w:t>
+      </w:r>
+    </w:p>
+    <w:p>
+      <w:pPr>
+        <w:pStyle w:val="ListParagraph"/>
+        <w:numPr>
+          <w:ilvl w:val="0"/>
+          <w:numId w:val="3"/>
+        </w:numPr>
+        <w:spacing w:after="45"/>
+      </w:pPr>
+      <w:r>
+        <w:rPr>
+          <w:sz w:val="19"/>
+          <w:szCs w:val="19"/>
+        </w:rPr>
+        <w:t xml:space="preserve">If only the room seconds change while one video remains frozen, stop testing, download the detailed report before refreshing, and mark the case failed.</w:t>
       </w:r>
     </w:p>
     <w:p>
@@ -988,7 +1096,7 @@
           <w:sz w:val="19"/>
           <w:szCs w:val="19"/>
         </w:rPr>
-        <w:t xml:space="preserve">Pass criteria: Pass when no refresh is required, the room does not resume before the guest confirms the target, and a slow seek leaves the room safely paused.</w:t>
+        <w:t xml:space="preserve">Pass criteria: Pass when no refresh is required, both real videos reach the target, the room does not resume before the guest confirms the target, and a slow seek leaves the room safely paused.</w:t>
       </w:r>
     </w:p>
     <w:p>
@@ -1000,7 +1108,7 @@
         <w:rPr>
           <w:color w:val="0F766E"/>
         </w:rPr>
-        <w:t xml:space="preserve">6. Test C - autoplay and manual recovery</w:t>
+        <w:t xml:space="preserve">7. Test C - autoplay and manual recovery</w:t>
       </w:r>
     </w:p>
     <w:p>
@@ -1085,7 +1193,7 @@
           <w:sz w:val="19"/>
           <w:szCs w:val="19"/>
         </w:rPr>
-        <w:t xml:space="preserve">Confirm the guest joins the authoritative position without a refresh.</w:t>
+        <w:t xml:space="preserve">Confirm the guest joins the authoritative position without a refresh and that its real video continues progressing for at least 15 seconds.</w:t>
       </w:r>
     </w:p>
     <w:p>
@@ -1112,7 +1220,7 @@
         <w:rPr>
           <w:color w:val="0F766E"/>
         </w:rPr>
-        <w:t xml:space="preserve">7. Test D - reconnect and readiness stability</w:t>
+        <w:t xml:space="preserve">8. Test D - reconnect and readiness stability</w:t>
       </w:r>
     </w:p>
     <w:p>
@@ -1180,7 +1288,7 @@
           <w:sz w:val="19"/>
           <w:szCs w:val="19"/>
         </w:rPr>
-        <w:t xml:space="preserve">Confirm a brief reconnect with the same video does not unnecessarily cancel readiness.</w:t>
+        <w:t xml:space="preserve">Confirm a brief reconnect with the same video does not unnecessarily cancel readiness. If readiness cancels, record whether the media URL, selected player, or room connection actually changed.</w:t>
       </w:r>
     </w:p>
     <w:p>
@@ -1258,7 +1366,7 @@
         <w:rPr>
           <w:color w:val="0F766E"/>
         </w:rPr>
-        <w:t xml:space="preserve">8. Test E - controller handoff</w:t>
+        <w:t xml:space="preserve">9. Test E - controller handoff</w:t>
       </w:r>
     </w:p>
     <w:p>
@@ -1370,7 +1478,7 @@
         <w:rPr>
           <w:color w:val="0F766E"/>
         </w:rPr>
-        <w:t xml:space="preserve">9. Test F - matching and multiple players</w:t>
+        <w:t xml:space="preserve">10. Test F - matching and multiple players</w:t>
       </w:r>
     </w:p>
     <w:p>
@@ -1499,7 +1607,7 @@
         <w:rPr>
           <w:color w:val="0F766E"/>
         </w:rPr>
-        <w:t xml:space="preserve">10. Test G - network-quality and chaos</w:t>
+        <w:t xml:space="preserve">11. Test G - network-quality and chaos</w:t>
       </w:r>
     </w:p>
     <w:p>
@@ -1628,109 +1736,7 @@
         <w:rPr>
           <w:color w:val="0F766E"/>
         </w:rPr>
-        <w:t xml:space="preserve">11. Download the detailed report</w:t>
-      </w:r>
-    </w:p>
-    <w:p>
-      <w:pPr>
-        <w:pStyle w:val="ListParagraph"/>
-        <w:numPr>
-          <w:ilvl w:val="0"/>
-          <w:numId w:val="3"/>
-        </w:numPr>
-        <w:spacing w:after="45"/>
-      </w:pPr>
-      <w:r>
-        <w:rPr>
-          <w:sz w:val="19"/>
-          <w:szCs w:val="19"/>
-        </w:rPr>
-        <w:t xml:space="preserve">Only the room controller can collect the room-wide report.</w:t>
-      </w:r>
-    </w:p>
-    <w:p>
-      <w:pPr>
-        <w:pStyle w:val="ListParagraph"/>
-        <w:numPr>
-          <w:ilvl w:val="0"/>
-          <w:numId w:val="3"/>
-        </w:numPr>
-        <w:spacing w:after="45"/>
-      </w:pPr>
-      <w:r>
-        <w:rPr>
-          <w:sz w:val="19"/>
-          <w:szCs w:val="19"/>
-        </w:rPr>
-        <w:t xml:space="preserve">Open the side panel while the room is connected.</w:t>
-      </w:r>
-    </w:p>
-    <w:p>
-      <w:pPr>
-        <w:pStyle w:val="ListParagraph"/>
-        <w:numPr>
-          <w:ilvl w:val="0"/>
-          <w:numId w:val="3"/>
-        </w:numPr>
-        <w:spacing w:after="45"/>
-      </w:pPr>
-      <w:r>
-        <w:rPr>
-          <w:sz w:val="19"/>
-          <w:szCs w:val="19"/>
-        </w:rPr>
-        <w:t xml:space="preserve">Find Beta diagnostics and select Download detailed report.</w:t>
-      </w:r>
-    </w:p>
-    <w:p>
-      <w:pPr>
-        <w:pStyle w:val="ListParagraph"/>
-        <w:numPr>
-          <w:ilvl w:val="0"/>
-          <w:numId w:val="3"/>
-        </w:numPr>
-        <w:spacing w:after="45"/>
-      </w:pPr>
-      <w:r>
-        <w:rPr>
-          <w:sz w:val="19"/>
-          <w:szCs w:val="19"/>
-        </w:rPr>
-        <w:t xml:space="preserve">Wait for the JSON file to download.</w:t>
-      </w:r>
-    </w:p>
-    <w:p>
-      <w:pPr>
-        <w:pStyle w:val="ListParagraph"/>
-        <w:numPr>
-          <w:ilvl w:val="0"/>
-          <w:numId w:val="3"/>
-        </w:numPr>
-        <w:spacing w:after="45"/>
-      </w:pPr>
-      <w:r>
-        <w:rPr>
-          <w:sz w:val="19"/>
-          <w:szCs w:val="19"/>
-        </w:rPr>
-        <w:t xml:space="preserve">Keep the report with the exact test step and time of the failure.</w:t>
-      </w:r>
-    </w:p>
-    <w:p>
-      <w:pPr>
-        <w:pStyle w:val="ListParagraph"/>
-        <w:numPr>
-          <w:ilvl w:val="0"/>
-          <w:numId w:val="3"/>
-        </w:numPr>
-        <w:spacing w:after="45"/>
-      </w:pPr>
-      <w:r>
-        <w:rPr>
-          <w:sz w:val="19"/>
-          <w:szCs w:val="19"/>
-        </w:rPr>
-        <w:t xml:space="preserve">Review the report before sharing. Do not attach unrelated private files.</w:t>
+        <w:t xml:space="preserve">12. Test H - provider and browser matrix</w:t>
       </w:r>
     </w:p>
     <w:p>
@@ -1745,9 +1751,1968 @@
           <w:sz w:val="20"/>
           <w:szCs w:val="20"/>
         </w:rPr>
-        <w:t xml:space="preserve">The report is testing-only. It is designed to exclude passwords, cookies, media bytes, audio, screenshots, and URL query parameters.</w:t>
-      </w:r>
-    </w:p>
+        <w:t xml:space="preserve">Run the core play/pause and forward/backward seek tests on each provider you intend to claim in release notes. Use the same room and test order, but do not assume that success on one provider proves another provider.</w:t>
+      </w:r>
+    </w:p>
+    <w:tbl>
+      <w:tblPr>
+        <w:tblW w:type="pct" w:w="100%"/>
+        <w:tblBorders>
+          <w:top w:val="single" w:color="auto" w:sz="4"/>
+          <w:left w:val="single" w:color="auto" w:sz="4"/>
+          <w:bottom w:val="single" w:color="auto" w:sz="4"/>
+          <w:right w:val="single" w:color="auto" w:sz="4"/>
+          <w:insideH w:val="single" w:color="auto" w:sz="4"/>
+          <w:insideV w:val="single" w:color="auto" w:sz="4"/>
+        </w:tblBorders>
+      </w:tblPr>
+      <w:tblGrid>
+        <w:gridCol w:w="2200"/>
+        <w:gridCol w:w="900"/>
+        <w:gridCol w:w="800"/>
+        <w:gridCol w:w="900"/>
+        <w:gridCol w:w="800"/>
+        <w:gridCol w:w="800"/>
+        <w:gridCol w:w="800"/>
+        <w:gridCol w:w="1000"/>
+      </w:tblGrid>
+      <w:tr>
+        <w:tc>
+          <w:tcPr>
+            <w:tcW w:type="dxa" w:w="2200"/>
+            <w:tcBorders>
+              <w:top w:val="single" w:color="D8E3E1" w:sz="2"/>
+              <w:left w:val="single" w:color="D8E3E1" w:sz="2"/>
+              <w:bottom w:val="single" w:color="D8E3E1" w:sz="2"/>
+              <w:right w:val="single" w:color="D8E3E1" w:sz="2"/>
+            </w:tcBorders>
+            <w:shd w:fill="E8F4F2" w:val="clear"/>
+            <w:tcMar>
+              <w:top w:type="dxa" w:w="90"/>
+              <w:left w:type="dxa" w:w="100"/>
+              <w:bottom w:type="dxa" w:w="90"/>
+              <w:right w:type="dxa" w:w="100"/>
+            </w:tcMar>
+          </w:tcPr>
+          <w:p>
+            <w:r>
+              <w:rPr>
+                <w:b/>
+                <w:bCs/>
+                <w:color w:val="16303A"/>
+                <w:sz w:val="17"/>
+                <w:szCs w:val="17"/>
+              </w:rPr>
+              <w:t xml:space="preserve">Provider/page</w:t>
+            </w:r>
+          </w:p>
+        </w:tc>
+        <w:tc>
+          <w:tcPr>
+            <w:tcW w:type="dxa" w:w="900"/>
+            <w:tcBorders>
+              <w:top w:val="single" w:color="D8E3E1" w:sz="2"/>
+              <w:left w:val="single" w:color="D8E3E1" w:sz="2"/>
+              <w:bottom w:val="single" w:color="D8E3E1" w:sz="2"/>
+              <w:right w:val="single" w:color="D8E3E1" w:sz="2"/>
+            </w:tcBorders>
+            <w:shd w:fill="E8F4F2" w:val="clear"/>
+            <w:tcMar>
+              <w:top w:type="dxa" w:w="90"/>
+              <w:left w:type="dxa" w:w="100"/>
+              <w:bottom w:type="dxa" w:w="90"/>
+              <w:right w:type="dxa" w:w="100"/>
+            </w:tcMar>
+          </w:tcPr>
+          <w:p>
+            <w:r>
+              <w:rPr>
+                <w:b/>
+                <w:bCs/>
+                <w:color w:val="16303A"/>
+                <w:sz w:val="17"/>
+                <w:szCs w:val="17"/>
+              </w:rPr>
+              <w:t xml:space="preserve">Browser</w:t>
+            </w:r>
+          </w:p>
+        </w:tc>
+        <w:tc>
+          <w:tcPr>
+            <w:tcW w:type="dxa" w:w="800"/>
+            <w:tcBorders>
+              <w:top w:val="single" w:color="D8E3E1" w:sz="2"/>
+              <w:left w:val="single" w:color="D8E3E1" w:sz="2"/>
+              <w:bottom w:val="single" w:color="D8E3E1" w:sz="2"/>
+              <w:right w:val="single" w:color="D8E3E1" w:sz="2"/>
+            </w:tcBorders>
+            <w:shd w:fill="E8F4F2" w:val="clear"/>
+            <w:tcMar>
+              <w:top w:type="dxa" w:w="90"/>
+              <w:left w:type="dxa" w:w="100"/>
+              <w:bottom w:type="dxa" w:w="90"/>
+              <w:right w:type="dxa" w:w="100"/>
+            </w:tcMar>
+          </w:tcPr>
+          <w:p>
+            <w:r>
+              <w:rPr>
+                <w:b/>
+                <w:bCs/>
+                <w:color w:val="16303A"/>
+                <w:sz w:val="17"/>
+                <w:szCs w:val="17"/>
+              </w:rPr>
+              <w:t xml:space="preserve">Account</w:t>
+            </w:r>
+          </w:p>
+        </w:tc>
+        <w:tc>
+          <w:tcPr>
+            <w:tcW w:type="dxa" w:w="900"/>
+            <w:tcBorders>
+              <w:top w:val="single" w:color="D8E3E1" w:sz="2"/>
+              <w:left w:val="single" w:color="D8E3E1" w:sz="2"/>
+              <w:bottom w:val="single" w:color="D8E3E1" w:sz="2"/>
+              <w:right w:val="single" w:color="D8E3E1" w:sz="2"/>
+            </w:tcBorders>
+            <w:shd w:fill="E8F4F2" w:val="clear"/>
+            <w:tcMar>
+              <w:top w:type="dxa" w:w="90"/>
+              <w:left w:type="dxa" w:w="100"/>
+              <w:bottom w:type="dxa" w:w="90"/>
+              <w:right w:type="dxa" w:w="100"/>
+            </w:tcMar>
+          </w:tcPr>
+          <w:p>
+            <w:r>
+              <w:rPr>
+                <w:b/>
+                <w:bCs/>
+                <w:color w:val="16303A"/>
+                <w:sz w:val="17"/>
+                <w:szCs w:val="17"/>
+              </w:rPr>
+              <w:t xml:space="preserve">Play/pause</w:t>
+            </w:r>
+          </w:p>
+        </w:tc>
+        <w:tc>
+          <w:tcPr>
+            <w:tcW w:type="dxa" w:w="800"/>
+            <w:tcBorders>
+              <w:top w:val="single" w:color="D8E3E1" w:sz="2"/>
+              <w:left w:val="single" w:color="D8E3E1" w:sz="2"/>
+              <w:bottom w:val="single" w:color="D8E3E1" w:sz="2"/>
+              <w:right w:val="single" w:color="D8E3E1" w:sz="2"/>
+            </w:tcBorders>
+            <w:shd w:fill="E8F4F2" w:val="clear"/>
+            <w:tcMar>
+              <w:top w:type="dxa" w:w="90"/>
+              <w:left w:type="dxa" w:w="100"/>
+              <w:bottom w:type="dxa" w:w="90"/>
+              <w:right w:type="dxa" w:w="100"/>
+            </w:tcMar>
+          </w:tcPr>
+          <w:p>
+            <w:r>
+              <w:rPr>
+                <w:b/>
+                <w:bCs/>
+                <w:color w:val="16303A"/>
+                <w:sz w:val="17"/>
+                <w:szCs w:val="17"/>
+              </w:rPr>
+              <w:t xml:space="preserve">Forward</w:t>
+            </w:r>
+          </w:p>
+        </w:tc>
+        <w:tc>
+          <w:tcPr>
+            <w:tcW w:type="dxa" w:w="800"/>
+            <w:tcBorders>
+              <w:top w:val="single" w:color="D8E3E1" w:sz="2"/>
+              <w:left w:val="single" w:color="D8E3E1" w:sz="2"/>
+              <w:bottom w:val="single" w:color="D8E3E1" w:sz="2"/>
+              <w:right w:val="single" w:color="D8E3E1" w:sz="2"/>
+            </w:tcBorders>
+            <w:shd w:fill="E8F4F2" w:val="clear"/>
+            <w:tcMar>
+              <w:top w:type="dxa" w:w="90"/>
+              <w:left w:type="dxa" w:w="100"/>
+              <w:bottom w:type="dxa" w:w="90"/>
+              <w:right w:type="dxa" w:w="100"/>
+            </w:tcMar>
+          </w:tcPr>
+          <w:p>
+            <w:r>
+              <w:rPr>
+                <w:b/>
+                <w:bCs/>
+                <w:color w:val="16303A"/>
+                <w:sz w:val="17"/>
+                <w:szCs w:val="17"/>
+              </w:rPr>
+              <w:t xml:space="preserve">Backward</w:t>
+            </w:r>
+          </w:p>
+        </w:tc>
+        <w:tc>
+          <w:tcPr>
+            <w:tcW w:type="dxa" w:w="800"/>
+            <w:tcBorders>
+              <w:top w:val="single" w:color="D8E3E1" w:sz="2"/>
+              <w:left w:val="single" w:color="D8E3E1" w:sz="2"/>
+              <w:bottom w:val="single" w:color="D8E3E1" w:sz="2"/>
+              <w:right w:val="single" w:color="D8E3E1" w:sz="2"/>
+            </w:tcBorders>
+            <w:shd w:fill="E8F4F2" w:val="clear"/>
+            <w:tcMar>
+              <w:top w:type="dxa" w:w="90"/>
+              <w:left w:type="dxa" w:w="100"/>
+              <w:bottom w:type="dxa" w:w="90"/>
+              <w:right w:type="dxa" w:w="100"/>
+            </w:tcMar>
+          </w:tcPr>
+          <w:p>
+            <w:r>
+              <w:rPr>
+                <w:b/>
+                <w:bCs/>
+                <w:color w:val="16303A"/>
+                <w:sz w:val="17"/>
+                <w:szCs w:val="17"/>
+              </w:rPr>
+              <w:t xml:space="preserve">Progress</w:t>
+            </w:r>
+          </w:p>
+        </w:tc>
+        <w:tc>
+          <w:tcPr>
+            <w:tcW w:type="dxa" w:w="1000"/>
+            <w:tcBorders>
+              <w:top w:val="single" w:color="D8E3E1" w:sz="2"/>
+              <w:left w:val="single" w:color="D8E3E1" w:sz="2"/>
+              <w:bottom w:val="single" w:color="D8E3E1" w:sz="2"/>
+              <w:right w:val="single" w:color="D8E3E1" w:sz="2"/>
+            </w:tcBorders>
+            <w:shd w:fill="E8F4F2" w:val="clear"/>
+            <w:tcMar>
+              <w:top w:type="dxa" w:w="90"/>
+              <w:left w:type="dxa" w:w="100"/>
+              <w:bottom w:type="dxa" w:w="90"/>
+              <w:right w:type="dxa" w:w="100"/>
+            </w:tcMar>
+          </w:tcPr>
+          <w:p>
+            <w:r>
+              <w:rPr>
+                <w:b/>
+                <w:bCs/>
+                <w:color w:val="16303A"/>
+                <w:sz w:val="17"/>
+                <w:szCs w:val="17"/>
+              </w:rPr>
+              <w:t xml:space="preserve">Report</w:t>
+            </w:r>
+          </w:p>
+        </w:tc>
+      </w:tr>
+      <w:tr>
+        <w:tc>
+          <w:tcPr>
+            <w:tcW w:type="dxa" w:w="2200"/>
+            <w:tcBorders>
+              <w:top w:val="single" w:color="D8E3E1" w:sz="2"/>
+              <w:left w:val="single" w:color="D8E3E1" w:sz="2"/>
+              <w:bottom w:val="single" w:color="D8E3E1" w:sz="2"/>
+              <w:right w:val="single" w:color="D8E3E1" w:sz="2"/>
+            </w:tcBorders>
+            <w:shd w:fill="FFFFFF" w:val="clear"/>
+            <w:tcMar>
+              <w:top w:type="dxa" w:w="90"/>
+              <w:left w:type="dxa" w:w="100"/>
+              <w:bottom w:type="dxa" w:w="90"/>
+              <w:right w:type="dxa" w:w="100"/>
+            </w:tcMar>
+          </w:tcPr>
+          <w:p>
+            <w:r>
+              <w:rPr>
+                <w:b w:val="false"/>
+                <w:bCs w:val="false"/>
+                <w:color w:val="24353A"/>
+                <w:sz w:val="17"/>
+                <w:szCs w:val="17"/>
+              </w:rPr>
+              <w:t xml:space="preserve">Generic HTML5 fixture</w:t>
+            </w:r>
+          </w:p>
+        </w:tc>
+        <w:tc>
+          <w:tcPr>
+            <w:tcW w:type="dxa" w:w="900"/>
+            <w:tcBorders>
+              <w:top w:val="single" w:color="D8E3E1" w:sz="2"/>
+              <w:left w:val="single" w:color="D8E3E1" w:sz="2"/>
+              <w:bottom w:val="single" w:color="D8E3E1" w:sz="2"/>
+              <w:right w:val="single" w:color="D8E3E1" w:sz="2"/>
+            </w:tcBorders>
+            <w:shd w:fill="FFFFFF" w:val="clear"/>
+            <w:tcMar>
+              <w:top w:type="dxa" w:w="90"/>
+              <w:left w:type="dxa" w:w="100"/>
+              <w:bottom w:type="dxa" w:w="90"/>
+              <w:right w:type="dxa" w:w="100"/>
+            </w:tcMar>
+          </w:tcPr>
+          <w:p>
+            <w:r>
+              <w:rPr>
+                <w:b w:val="false"/>
+                <w:bCs w:val="false"/>
+                <w:color w:val="24353A"/>
+                <w:sz w:val="17"/>
+                <w:szCs w:val="17"/>
+              </w:rPr>
+              <w:t xml:space="preserve">Chrome</w:t>
+            </w:r>
+          </w:p>
+        </w:tc>
+        <w:tc>
+          <w:tcPr>
+            <w:tcW w:type="dxa" w:w="800"/>
+            <w:tcBorders>
+              <w:top w:val="single" w:color="D8E3E1" w:sz="2"/>
+              <w:left w:val="single" w:color="D8E3E1" w:sz="2"/>
+              <w:bottom w:val="single" w:color="D8E3E1" w:sz="2"/>
+              <w:right w:val="single" w:color="D8E3E1" w:sz="2"/>
+            </w:tcBorders>
+            <w:shd w:fill="FFFFFF" w:val="clear"/>
+            <w:tcMar>
+              <w:top w:type="dxa" w:w="90"/>
+              <w:left w:type="dxa" w:w="100"/>
+              <w:bottom w:type="dxa" w:w="90"/>
+              <w:right w:type="dxa" w:w="100"/>
+            </w:tcMar>
+          </w:tcPr>
+          <w:p>
+            <w:r>
+              <w:rPr>
+                <w:b w:val="false"/>
+                <w:bCs w:val="false"/>
+                <w:color w:val="24353A"/>
+                <w:sz w:val="17"/>
+                <w:szCs w:val="17"/>
+              </w:rPr>
+              <w:t xml:space="preserve">N/A</w:t>
+            </w:r>
+          </w:p>
+        </w:tc>
+        <w:tc>
+          <w:tcPr>
+            <w:tcW w:type="dxa" w:w="900"/>
+            <w:tcBorders>
+              <w:top w:val="single" w:color="D8E3E1" w:sz="2"/>
+              <w:left w:val="single" w:color="D8E3E1" w:sz="2"/>
+              <w:bottom w:val="single" w:color="D8E3E1" w:sz="2"/>
+              <w:right w:val="single" w:color="D8E3E1" w:sz="2"/>
+            </w:tcBorders>
+            <w:shd w:fill="FFFFFF" w:val="clear"/>
+            <w:tcMar>
+              <w:top w:type="dxa" w:w="90"/>
+              <w:left w:type="dxa" w:w="100"/>
+              <w:bottom w:type="dxa" w:w="90"/>
+              <w:right w:type="dxa" w:w="100"/>
+            </w:tcMar>
+          </w:tcPr>
+          <w:p>
+            <w:r>
+              <w:rPr>
+                <w:b w:val="false"/>
+                <w:bCs w:val="false"/>
+                <w:color w:val="24353A"/>
+                <w:sz w:val="17"/>
+                <w:szCs w:val="17"/>
+              </w:rPr>
+              <w:t xml:space="preserve"> </w:t>
+            </w:r>
+          </w:p>
+        </w:tc>
+        <w:tc>
+          <w:tcPr>
+            <w:tcW w:type="dxa" w:w="800"/>
+            <w:tcBorders>
+              <w:top w:val="single" w:color="D8E3E1" w:sz="2"/>
+              <w:left w:val="single" w:color="D8E3E1" w:sz="2"/>
+              <w:bottom w:val="single" w:color="D8E3E1" w:sz="2"/>
+              <w:right w:val="single" w:color="D8E3E1" w:sz="2"/>
+            </w:tcBorders>
+            <w:shd w:fill="FFFFFF" w:val="clear"/>
+            <w:tcMar>
+              <w:top w:type="dxa" w:w="90"/>
+              <w:left w:type="dxa" w:w="100"/>
+              <w:bottom w:type="dxa" w:w="90"/>
+              <w:right w:type="dxa" w:w="100"/>
+            </w:tcMar>
+          </w:tcPr>
+          <w:p>
+            <w:r>
+              <w:rPr>
+                <w:b w:val="false"/>
+                <w:bCs w:val="false"/>
+                <w:color w:val="24353A"/>
+                <w:sz w:val="17"/>
+                <w:szCs w:val="17"/>
+              </w:rPr>
+              <w:t xml:space="preserve"> </w:t>
+            </w:r>
+          </w:p>
+        </w:tc>
+        <w:tc>
+          <w:tcPr>
+            <w:tcW w:type="dxa" w:w="800"/>
+            <w:tcBorders>
+              <w:top w:val="single" w:color="D8E3E1" w:sz="2"/>
+              <w:left w:val="single" w:color="D8E3E1" w:sz="2"/>
+              <w:bottom w:val="single" w:color="D8E3E1" w:sz="2"/>
+              <w:right w:val="single" w:color="D8E3E1" w:sz="2"/>
+            </w:tcBorders>
+            <w:shd w:fill="FFFFFF" w:val="clear"/>
+            <w:tcMar>
+              <w:top w:type="dxa" w:w="90"/>
+              <w:left w:type="dxa" w:w="100"/>
+              <w:bottom w:type="dxa" w:w="90"/>
+              <w:right w:type="dxa" w:w="100"/>
+            </w:tcMar>
+          </w:tcPr>
+          <w:p>
+            <w:r>
+              <w:rPr>
+                <w:b w:val="false"/>
+                <w:bCs w:val="false"/>
+                <w:color w:val="24353A"/>
+                <w:sz w:val="17"/>
+                <w:szCs w:val="17"/>
+              </w:rPr>
+              <w:t xml:space="preserve"> </w:t>
+            </w:r>
+          </w:p>
+        </w:tc>
+        <w:tc>
+          <w:tcPr>
+            <w:tcW w:type="dxa" w:w="800"/>
+            <w:tcBorders>
+              <w:top w:val="single" w:color="D8E3E1" w:sz="2"/>
+              <w:left w:val="single" w:color="D8E3E1" w:sz="2"/>
+              <w:bottom w:val="single" w:color="D8E3E1" w:sz="2"/>
+              <w:right w:val="single" w:color="D8E3E1" w:sz="2"/>
+            </w:tcBorders>
+            <w:shd w:fill="FFFFFF" w:val="clear"/>
+            <w:tcMar>
+              <w:top w:type="dxa" w:w="90"/>
+              <w:left w:type="dxa" w:w="100"/>
+              <w:bottom w:type="dxa" w:w="90"/>
+              <w:right w:type="dxa" w:w="100"/>
+            </w:tcMar>
+          </w:tcPr>
+          <w:p>
+            <w:r>
+              <w:rPr>
+                <w:b w:val="false"/>
+                <w:bCs w:val="false"/>
+                <w:color w:val="24353A"/>
+                <w:sz w:val="17"/>
+                <w:szCs w:val="17"/>
+              </w:rPr>
+              <w:t xml:space="preserve"> </w:t>
+            </w:r>
+          </w:p>
+        </w:tc>
+        <w:tc>
+          <w:tcPr>
+            <w:tcW w:type="dxa" w:w="1000"/>
+            <w:tcBorders>
+              <w:top w:val="single" w:color="D8E3E1" w:sz="2"/>
+              <w:left w:val="single" w:color="D8E3E1" w:sz="2"/>
+              <w:bottom w:val="single" w:color="D8E3E1" w:sz="2"/>
+              <w:right w:val="single" w:color="D8E3E1" w:sz="2"/>
+            </w:tcBorders>
+            <w:shd w:fill="FFFFFF" w:val="clear"/>
+            <w:tcMar>
+              <w:top w:type="dxa" w:w="90"/>
+              <w:left w:type="dxa" w:w="100"/>
+              <w:bottom w:type="dxa" w:w="90"/>
+              <w:right w:type="dxa" w:w="100"/>
+            </w:tcMar>
+          </w:tcPr>
+          <w:p>
+            <w:r>
+              <w:rPr>
+                <w:b w:val="false"/>
+                <w:bCs w:val="false"/>
+                <w:color w:val="24353A"/>
+                <w:sz w:val="17"/>
+                <w:szCs w:val="17"/>
+              </w:rPr>
+              <w:t xml:space="preserve"> </w:t>
+            </w:r>
+          </w:p>
+        </w:tc>
+      </w:tr>
+      <w:tr>
+        <w:tc>
+          <w:tcPr>
+            <w:tcW w:type="dxa" w:w="2200"/>
+            <w:tcBorders>
+              <w:top w:val="single" w:color="D8E3E1" w:sz="2"/>
+              <w:left w:val="single" w:color="D8E3E1" w:sz="2"/>
+              <w:bottom w:val="single" w:color="D8E3E1" w:sz="2"/>
+              <w:right w:val="single" w:color="D8E3E1" w:sz="2"/>
+            </w:tcBorders>
+            <w:shd w:fill="FFFFFF" w:val="clear"/>
+            <w:tcMar>
+              <w:top w:type="dxa" w:w="90"/>
+              <w:left w:type="dxa" w:w="100"/>
+              <w:bottom w:type="dxa" w:w="90"/>
+              <w:right w:type="dxa" w:w="100"/>
+            </w:tcMar>
+          </w:tcPr>
+          <w:p>
+            <w:r>
+              <w:rPr>
+                <w:b w:val="false"/>
+                <w:bCs w:val="false"/>
+                <w:color w:val="24353A"/>
+                <w:sz w:val="17"/>
+                <w:szCs w:val="17"/>
+              </w:rPr>
+              <w:t xml:space="preserve">Crunchyroll</w:t>
+            </w:r>
+          </w:p>
+        </w:tc>
+        <w:tc>
+          <w:tcPr>
+            <w:tcW w:type="dxa" w:w="900"/>
+            <w:tcBorders>
+              <w:top w:val="single" w:color="D8E3E1" w:sz="2"/>
+              <w:left w:val="single" w:color="D8E3E1" w:sz="2"/>
+              <w:bottom w:val="single" w:color="D8E3E1" w:sz="2"/>
+              <w:right w:val="single" w:color="D8E3E1" w:sz="2"/>
+            </w:tcBorders>
+            <w:shd w:fill="FFFFFF" w:val="clear"/>
+            <w:tcMar>
+              <w:top w:type="dxa" w:w="90"/>
+              <w:left w:type="dxa" w:w="100"/>
+              <w:bottom w:type="dxa" w:w="90"/>
+              <w:right w:type="dxa" w:w="100"/>
+            </w:tcMar>
+          </w:tcPr>
+          <w:p>
+            <w:r>
+              <w:rPr>
+                <w:b w:val="false"/>
+                <w:bCs w:val="false"/>
+                <w:color w:val="24353A"/>
+                <w:sz w:val="17"/>
+                <w:szCs w:val="17"/>
+              </w:rPr>
+              <w:t xml:space="preserve">Chrome</w:t>
+            </w:r>
+          </w:p>
+        </w:tc>
+        <w:tc>
+          <w:tcPr>
+            <w:tcW w:type="dxa" w:w="800"/>
+            <w:tcBorders>
+              <w:top w:val="single" w:color="D8E3E1" w:sz="2"/>
+              <w:left w:val="single" w:color="D8E3E1" w:sz="2"/>
+              <w:bottom w:val="single" w:color="D8E3E1" w:sz="2"/>
+              <w:right w:val="single" w:color="D8E3E1" w:sz="2"/>
+            </w:tcBorders>
+            <w:shd w:fill="FFFFFF" w:val="clear"/>
+            <w:tcMar>
+              <w:top w:type="dxa" w:w="90"/>
+              <w:left w:type="dxa" w:w="100"/>
+              <w:bottom w:type="dxa" w:w="90"/>
+              <w:right w:type="dxa" w:w="100"/>
+            </w:tcMar>
+          </w:tcPr>
+          <w:p>
+            <w:r>
+              <w:rPr>
+                <w:b w:val="false"/>
+                <w:bCs w:val="false"/>
+                <w:color w:val="24353A"/>
+                <w:sz w:val="17"/>
+                <w:szCs w:val="17"/>
+              </w:rPr>
+              <w:t xml:space="preserve"> </w:t>
+            </w:r>
+          </w:p>
+        </w:tc>
+        <w:tc>
+          <w:tcPr>
+            <w:tcW w:type="dxa" w:w="900"/>
+            <w:tcBorders>
+              <w:top w:val="single" w:color="D8E3E1" w:sz="2"/>
+              <w:left w:val="single" w:color="D8E3E1" w:sz="2"/>
+              <w:bottom w:val="single" w:color="D8E3E1" w:sz="2"/>
+              <w:right w:val="single" w:color="D8E3E1" w:sz="2"/>
+            </w:tcBorders>
+            <w:shd w:fill="FFFFFF" w:val="clear"/>
+            <w:tcMar>
+              <w:top w:type="dxa" w:w="90"/>
+              <w:left w:type="dxa" w:w="100"/>
+              <w:bottom w:type="dxa" w:w="90"/>
+              <w:right w:type="dxa" w:w="100"/>
+            </w:tcMar>
+          </w:tcPr>
+          <w:p>
+            <w:r>
+              <w:rPr>
+                <w:b w:val="false"/>
+                <w:bCs w:val="false"/>
+                <w:color w:val="24353A"/>
+                <w:sz w:val="17"/>
+                <w:szCs w:val="17"/>
+              </w:rPr>
+              <w:t xml:space="preserve"> </w:t>
+            </w:r>
+          </w:p>
+        </w:tc>
+        <w:tc>
+          <w:tcPr>
+            <w:tcW w:type="dxa" w:w="800"/>
+            <w:tcBorders>
+              <w:top w:val="single" w:color="D8E3E1" w:sz="2"/>
+              <w:left w:val="single" w:color="D8E3E1" w:sz="2"/>
+              <w:bottom w:val="single" w:color="D8E3E1" w:sz="2"/>
+              <w:right w:val="single" w:color="D8E3E1" w:sz="2"/>
+            </w:tcBorders>
+            <w:shd w:fill="FFFFFF" w:val="clear"/>
+            <w:tcMar>
+              <w:top w:type="dxa" w:w="90"/>
+              <w:left w:type="dxa" w:w="100"/>
+              <w:bottom w:type="dxa" w:w="90"/>
+              <w:right w:type="dxa" w:w="100"/>
+            </w:tcMar>
+          </w:tcPr>
+          <w:p>
+            <w:r>
+              <w:rPr>
+                <w:b w:val="false"/>
+                <w:bCs w:val="false"/>
+                <w:color w:val="24353A"/>
+                <w:sz w:val="17"/>
+                <w:szCs w:val="17"/>
+              </w:rPr>
+              <w:t xml:space="preserve"> </w:t>
+            </w:r>
+          </w:p>
+        </w:tc>
+        <w:tc>
+          <w:tcPr>
+            <w:tcW w:type="dxa" w:w="800"/>
+            <w:tcBorders>
+              <w:top w:val="single" w:color="D8E3E1" w:sz="2"/>
+              <w:left w:val="single" w:color="D8E3E1" w:sz="2"/>
+              <w:bottom w:val="single" w:color="D8E3E1" w:sz="2"/>
+              <w:right w:val="single" w:color="D8E3E1" w:sz="2"/>
+            </w:tcBorders>
+            <w:shd w:fill="FFFFFF" w:val="clear"/>
+            <w:tcMar>
+              <w:top w:type="dxa" w:w="90"/>
+              <w:left w:type="dxa" w:w="100"/>
+              <w:bottom w:type="dxa" w:w="90"/>
+              <w:right w:type="dxa" w:w="100"/>
+            </w:tcMar>
+          </w:tcPr>
+          <w:p>
+            <w:r>
+              <w:rPr>
+                <w:b w:val="false"/>
+                <w:bCs w:val="false"/>
+                <w:color w:val="24353A"/>
+                <w:sz w:val="17"/>
+                <w:szCs w:val="17"/>
+              </w:rPr>
+              <w:t xml:space="preserve"> </w:t>
+            </w:r>
+          </w:p>
+        </w:tc>
+        <w:tc>
+          <w:tcPr>
+            <w:tcW w:type="dxa" w:w="800"/>
+            <w:tcBorders>
+              <w:top w:val="single" w:color="D8E3E1" w:sz="2"/>
+              <w:left w:val="single" w:color="D8E3E1" w:sz="2"/>
+              <w:bottom w:val="single" w:color="D8E3E1" w:sz="2"/>
+              <w:right w:val="single" w:color="D8E3E1" w:sz="2"/>
+            </w:tcBorders>
+            <w:shd w:fill="FFFFFF" w:val="clear"/>
+            <w:tcMar>
+              <w:top w:type="dxa" w:w="90"/>
+              <w:left w:type="dxa" w:w="100"/>
+              <w:bottom w:type="dxa" w:w="90"/>
+              <w:right w:type="dxa" w:w="100"/>
+            </w:tcMar>
+          </w:tcPr>
+          <w:p>
+            <w:r>
+              <w:rPr>
+                <w:b w:val="false"/>
+                <w:bCs w:val="false"/>
+                <w:color w:val="24353A"/>
+                <w:sz w:val="17"/>
+                <w:szCs w:val="17"/>
+              </w:rPr>
+              <w:t xml:space="preserve"> </w:t>
+            </w:r>
+          </w:p>
+        </w:tc>
+        <w:tc>
+          <w:tcPr>
+            <w:tcW w:type="dxa" w:w="1000"/>
+            <w:tcBorders>
+              <w:top w:val="single" w:color="D8E3E1" w:sz="2"/>
+              <w:left w:val="single" w:color="D8E3E1" w:sz="2"/>
+              <w:bottom w:val="single" w:color="D8E3E1" w:sz="2"/>
+              <w:right w:val="single" w:color="D8E3E1" w:sz="2"/>
+            </w:tcBorders>
+            <w:shd w:fill="FFFFFF" w:val="clear"/>
+            <w:tcMar>
+              <w:top w:type="dxa" w:w="90"/>
+              <w:left w:type="dxa" w:w="100"/>
+              <w:bottom w:type="dxa" w:w="90"/>
+              <w:right w:type="dxa" w:w="100"/>
+            </w:tcMar>
+          </w:tcPr>
+          <w:p>
+            <w:r>
+              <w:rPr>
+                <w:b w:val="false"/>
+                <w:bCs w:val="false"/>
+                <w:color w:val="24353A"/>
+                <w:sz w:val="17"/>
+                <w:szCs w:val="17"/>
+              </w:rPr>
+              <w:t xml:space="preserve"> </w:t>
+            </w:r>
+          </w:p>
+        </w:tc>
+      </w:tr>
+      <w:tr>
+        <w:tc>
+          <w:tcPr>
+            <w:tcW w:type="dxa" w:w="2200"/>
+            <w:tcBorders>
+              <w:top w:val="single" w:color="D8E3E1" w:sz="2"/>
+              <w:left w:val="single" w:color="D8E3E1" w:sz="2"/>
+              <w:bottom w:val="single" w:color="D8E3E1" w:sz="2"/>
+              <w:right w:val="single" w:color="D8E3E1" w:sz="2"/>
+            </w:tcBorders>
+            <w:shd w:fill="FFFFFF" w:val="clear"/>
+            <w:tcMar>
+              <w:top w:type="dxa" w:w="90"/>
+              <w:left w:type="dxa" w:w="100"/>
+              <w:bottom w:type="dxa" w:w="90"/>
+              <w:right w:type="dxa" w:w="100"/>
+            </w:tcMar>
+          </w:tcPr>
+          <w:p>
+            <w:r>
+              <w:rPr>
+                <w:b w:val="false"/>
+                <w:bCs w:val="false"/>
+                <w:color w:val="24353A"/>
+                <w:sz w:val="17"/>
+                <w:szCs w:val="17"/>
+              </w:rPr>
+              <w:t xml:space="preserve">Netflix</w:t>
+            </w:r>
+          </w:p>
+        </w:tc>
+        <w:tc>
+          <w:tcPr>
+            <w:tcW w:type="dxa" w:w="900"/>
+            <w:tcBorders>
+              <w:top w:val="single" w:color="D8E3E1" w:sz="2"/>
+              <w:left w:val="single" w:color="D8E3E1" w:sz="2"/>
+              <w:bottom w:val="single" w:color="D8E3E1" w:sz="2"/>
+              <w:right w:val="single" w:color="D8E3E1" w:sz="2"/>
+            </w:tcBorders>
+            <w:shd w:fill="FFFFFF" w:val="clear"/>
+            <w:tcMar>
+              <w:top w:type="dxa" w:w="90"/>
+              <w:left w:type="dxa" w:w="100"/>
+              <w:bottom w:type="dxa" w:w="90"/>
+              <w:right w:type="dxa" w:w="100"/>
+            </w:tcMar>
+          </w:tcPr>
+          <w:p>
+            <w:r>
+              <w:rPr>
+                <w:b w:val="false"/>
+                <w:bCs w:val="false"/>
+                <w:color w:val="24353A"/>
+                <w:sz w:val="17"/>
+                <w:szCs w:val="17"/>
+              </w:rPr>
+              <w:t xml:space="preserve">Chrome</w:t>
+            </w:r>
+          </w:p>
+        </w:tc>
+        <w:tc>
+          <w:tcPr>
+            <w:tcW w:type="dxa" w:w="800"/>
+            <w:tcBorders>
+              <w:top w:val="single" w:color="D8E3E1" w:sz="2"/>
+              <w:left w:val="single" w:color="D8E3E1" w:sz="2"/>
+              <w:bottom w:val="single" w:color="D8E3E1" w:sz="2"/>
+              <w:right w:val="single" w:color="D8E3E1" w:sz="2"/>
+            </w:tcBorders>
+            <w:shd w:fill="FFFFFF" w:val="clear"/>
+            <w:tcMar>
+              <w:top w:type="dxa" w:w="90"/>
+              <w:left w:type="dxa" w:w="100"/>
+              <w:bottom w:type="dxa" w:w="90"/>
+              <w:right w:type="dxa" w:w="100"/>
+            </w:tcMar>
+          </w:tcPr>
+          <w:p>
+            <w:r>
+              <w:rPr>
+                <w:b w:val="false"/>
+                <w:bCs w:val="false"/>
+                <w:color w:val="24353A"/>
+                <w:sz w:val="17"/>
+                <w:szCs w:val="17"/>
+              </w:rPr>
+              <w:t xml:space="preserve"> </w:t>
+            </w:r>
+          </w:p>
+        </w:tc>
+        <w:tc>
+          <w:tcPr>
+            <w:tcW w:type="dxa" w:w="900"/>
+            <w:tcBorders>
+              <w:top w:val="single" w:color="D8E3E1" w:sz="2"/>
+              <w:left w:val="single" w:color="D8E3E1" w:sz="2"/>
+              <w:bottom w:val="single" w:color="D8E3E1" w:sz="2"/>
+              <w:right w:val="single" w:color="D8E3E1" w:sz="2"/>
+            </w:tcBorders>
+            <w:shd w:fill="FFFFFF" w:val="clear"/>
+            <w:tcMar>
+              <w:top w:type="dxa" w:w="90"/>
+              <w:left w:type="dxa" w:w="100"/>
+              <w:bottom w:type="dxa" w:w="90"/>
+              <w:right w:type="dxa" w:w="100"/>
+            </w:tcMar>
+          </w:tcPr>
+          <w:p>
+            <w:r>
+              <w:rPr>
+                <w:b w:val="false"/>
+                <w:bCs w:val="false"/>
+                <w:color w:val="24353A"/>
+                <w:sz w:val="17"/>
+                <w:szCs w:val="17"/>
+              </w:rPr>
+              <w:t xml:space="preserve"> </w:t>
+            </w:r>
+          </w:p>
+        </w:tc>
+        <w:tc>
+          <w:tcPr>
+            <w:tcW w:type="dxa" w:w="800"/>
+            <w:tcBorders>
+              <w:top w:val="single" w:color="D8E3E1" w:sz="2"/>
+              <w:left w:val="single" w:color="D8E3E1" w:sz="2"/>
+              <w:bottom w:val="single" w:color="D8E3E1" w:sz="2"/>
+              <w:right w:val="single" w:color="D8E3E1" w:sz="2"/>
+            </w:tcBorders>
+            <w:shd w:fill="FFFFFF" w:val="clear"/>
+            <w:tcMar>
+              <w:top w:type="dxa" w:w="90"/>
+              <w:left w:type="dxa" w:w="100"/>
+              <w:bottom w:type="dxa" w:w="90"/>
+              <w:right w:type="dxa" w:w="100"/>
+            </w:tcMar>
+          </w:tcPr>
+          <w:p>
+            <w:r>
+              <w:rPr>
+                <w:b w:val="false"/>
+                <w:bCs w:val="false"/>
+                <w:color w:val="24353A"/>
+                <w:sz w:val="17"/>
+                <w:szCs w:val="17"/>
+              </w:rPr>
+              <w:t xml:space="preserve"> </w:t>
+            </w:r>
+          </w:p>
+        </w:tc>
+        <w:tc>
+          <w:tcPr>
+            <w:tcW w:type="dxa" w:w="800"/>
+            <w:tcBorders>
+              <w:top w:val="single" w:color="D8E3E1" w:sz="2"/>
+              <w:left w:val="single" w:color="D8E3E1" w:sz="2"/>
+              <w:bottom w:val="single" w:color="D8E3E1" w:sz="2"/>
+              <w:right w:val="single" w:color="D8E3E1" w:sz="2"/>
+            </w:tcBorders>
+            <w:shd w:fill="FFFFFF" w:val="clear"/>
+            <w:tcMar>
+              <w:top w:type="dxa" w:w="90"/>
+              <w:left w:type="dxa" w:w="100"/>
+              <w:bottom w:type="dxa" w:w="90"/>
+              <w:right w:type="dxa" w:w="100"/>
+            </w:tcMar>
+          </w:tcPr>
+          <w:p>
+            <w:r>
+              <w:rPr>
+                <w:b w:val="false"/>
+                <w:bCs w:val="false"/>
+                <w:color w:val="24353A"/>
+                <w:sz w:val="17"/>
+                <w:szCs w:val="17"/>
+              </w:rPr>
+              <w:t xml:space="preserve"> </w:t>
+            </w:r>
+          </w:p>
+        </w:tc>
+        <w:tc>
+          <w:tcPr>
+            <w:tcW w:type="dxa" w:w="800"/>
+            <w:tcBorders>
+              <w:top w:val="single" w:color="D8E3E1" w:sz="2"/>
+              <w:left w:val="single" w:color="D8E3E1" w:sz="2"/>
+              <w:bottom w:val="single" w:color="D8E3E1" w:sz="2"/>
+              <w:right w:val="single" w:color="D8E3E1" w:sz="2"/>
+            </w:tcBorders>
+            <w:shd w:fill="FFFFFF" w:val="clear"/>
+            <w:tcMar>
+              <w:top w:type="dxa" w:w="90"/>
+              <w:left w:type="dxa" w:w="100"/>
+              <w:bottom w:type="dxa" w:w="90"/>
+              <w:right w:type="dxa" w:w="100"/>
+            </w:tcMar>
+          </w:tcPr>
+          <w:p>
+            <w:r>
+              <w:rPr>
+                <w:b w:val="false"/>
+                <w:bCs w:val="false"/>
+                <w:color w:val="24353A"/>
+                <w:sz w:val="17"/>
+                <w:szCs w:val="17"/>
+              </w:rPr>
+              <w:t xml:space="preserve"> </w:t>
+            </w:r>
+          </w:p>
+        </w:tc>
+        <w:tc>
+          <w:tcPr>
+            <w:tcW w:type="dxa" w:w="1000"/>
+            <w:tcBorders>
+              <w:top w:val="single" w:color="D8E3E1" w:sz="2"/>
+              <w:left w:val="single" w:color="D8E3E1" w:sz="2"/>
+              <w:bottom w:val="single" w:color="D8E3E1" w:sz="2"/>
+              <w:right w:val="single" w:color="D8E3E1" w:sz="2"/>
+            </w:tcBorders>
+            <w:shd w:fill="FFFFFF" w:val="clear"/>
+            <w:tcMar>
+              <w:top w:type="dxa" w:w="90"/>
+              <w:left w:type="dxa" w:w="100"/>
+              <w:bottom w:type="dxa" w:w="90"/>
+              <w:right w:type="dxa" w:w="100"/>
+            </w:tcMar>
+          </w:tcPr>
+          <w:p>
+            <w:r>
+              <w:rPr>
+                <w:b w:val="false"/>
+                <w:bCs w:val="false"/>
+                <w:color w:val="24353A"/>
+                <w:sz w:val="17"/>
+                <w:szCs w:val="17"/>
+              </w:rPr>
+              <w:t xml:space="preserve"> </w:t>
+            </w:r>
+          </w:p>
+        </w:tc>
+      </w:tr>
+      <w:tr>
+        <w:tc>
+          <w:tcPr>
+            <w:tcW w:type="dxa" w:w="2200"/>
+            <w:tcBorders>
+              <w:top w:val="single" w:color="D8E3E1" w:sz="2"/>
+              <w:left w:val="single" w:color="D8E3E1" w:sz="2"/>
+              <w:bottom w:val="single" w:color="D8E3E1" w:sz="2"/>
+              <w:right w:val="single" w:color="D8E3E1" w:sz="2"/>
+            </w:tcBorders>
+            <w:shd w:fill="FFFFFF" w:val="clear"/>
+            <w:tcMar>
+              <w:top w:type="dxa" w:w="90"/>
+              <w:left w:type="dxa" w:w="100"/>
+              <w:bottom w:type="dxa" w:w="90"/>
+              <w:right w:type="dxa" w:w="100"/>
+            </w:tcMar>
+          </w:tcPr>
+          <w:p>
+            <w:r>
+              <w:rPr>
+                <w:b w:val="false"/>
+                <w:bCs w:val="false"/>
+                <w:color w:val="24353A"/>
+                <w:sz w:val="17"/>
+                <w:szCs w:val="17"/>
+              </w:rPr>
+              <w:t xml:space="preserve">Disney+</w:t>
+            </w:r>
+          </w:p>
+        </w:tc>
+        <w:tc>
+          <w:tcPr>
+            <w:tcW w:type="dxa" w:w="900"/>
+            <w:tcBorders>
+              <w:top w:val="single" w:color="D8E3E1" w:sz="2"/>
+              <w:left w:val="single" w:color="D8E3E1" w:sz="2"/>
+              <w:bottom w:val="single" w:color="D8E3E1" w:sz="2"/>
+              <w:right w:val="single" w:color="D8E3E1" w:sz="2"/>
+            </w:tcBorders>
+            <w:shd w:fill="FFFFFF" w:val="clear"/>
+            <w:tcMar>
+              <w:top w:type="dxa" w:w="90"/>
+              <w:left w:type="dxa" w:w="100"/>
+              <w:bottom w:type="dxa" w:w="90"/>
+              <w:right w:type="dxa" w:w="100"/>
+            </w:tcMar>
+          </w:tcPr>
+          <w:p>
+            <w:r>
+              <w:rPr>
+                <w:b w:val="false"/>
+                <w:bCs w:val="false"/>
+                <w:color w:val="24353A"/>
+                <w:sz w:val="17"/>
+                <w:szCs w:val="17"/>
+              </w:rPr>
+              <w:t xml:space="preserve">Chrome</w:t>
+            </w:r>
+          </w:p>
+        </w:tc>
+        <w:tc>
+          <w:tcPr>
+            <w:tcW w:type="dxa" w:w="800"/>
+            <w:tcBorders>
+              <w:top w:val="single" w:color="D8E3E1" w:sz="2"/>
+              <w:left w:val="single" w:color="D8E3E1" w:sz="2"/>
+              <w:bottom w:val="single" w:color="D8E3E1" w:sz="2"/>
+              <w:right w:val="single" w:color="D8E3E1" w:sz="2"/>
+            </w:tcBorders>
+            <w:shd w:fill="FFFFFF" w:val="clear"/>
+            <w:tcMar>
+              <w:top w:type="dxa" w:w="90"/>
+              <w:left w:type="dxa" w:w="100"/>
+              <w:bottom w:type="dxa" w:w="90"/>
+              <w:right w:type="dxa" w:w="100"/>
+            </w:tcMar>
+          </w:tcPr>
+          <w:p>
+            <w:r>
+              <w:rPr>
+                <w:b w:val="false"/>
+                <w:bCs w:val="false"/>
+                <w:color w:val="24353A"/>
+                <w:sz w:val="17"/>
+                <w:szCs w:val="17"/>
+              </w:rPr>
+              <w:t xml:space="preserve"> </w:t>
+            </w:r>
+          </w:p>
+        </w:tc>
+        <w:tc>
+          <w:tcPr>
+            <w:tcW w:type="dxa" w:w="900"/>
+            <w:tcBorders>
+              <w:top w:val="single" w:color="D8E3E1" w:sz="2"/>
+              <w:left w:val="single" w:color="D8E3E1" w:sz="2"/>
+              <w:bottom w:val="single" w:color="D8E3E1" w:sz="2"/>
+              <w:right w:val="single" w:color="D8E3E1" w:sz="2"/>
+            </w:tcBorders>
+            <w:shd w:fill="FFFFFF" w:val="clear"/>
+            <w:tcMar>
+              <w:top w:type="dxa" w:w="90"/>
+              <w:left w:type="dxa" w:w="100"/>
+              <w:bottom w:type="dxa" w:w="90"/>
+              <w:right w:type="dxa" w:w="100"/>
+            </w:tcMar>
+          </w:tcPr>
+          <w:p>
+            <w:r>
+              <w:rPr>
+                <w:b w:val="false"/>
+                <w:bCs w:val="false"/>
+                <w:color w:val="24353A"/>
+                <w:sz w:val="17"/>
+                <w:szCs w:val="17"/>
+              </w:rPr>
+              <w:t xml:space="preserve"> </w:t>
+            </w:r>
+          </w:p>
+        </w:tc>
+        <w:tc>
+          <w:tcPr>
+            <w:tcW w:type="dxa" w:w="800"/>
+            <w:tcBorders>
+              <w:top w:val="single" w:color="D8E3E1" w:sz="2"/>
+              <w:left w:val="single" w:color="D8E3E1" w:sz="2"/>
+              <w:bottom w:val="single" w:color="D8E3E1" w:sz="2"/>
+              <w:right w:val="single" w:color="D8E3E1" w:sz="2"/>
+            </w:tcBorders>
+            <w:shd w:fill="FFFFFF" w:val="clear"/>
+            <w:tcMar>
+              <w:top w:type="dxa" w:w="90"/>
+              <w:left w:type="dxa" w:w="100"/>
+              <w:bottom w:type="dxa" w:w="90"/>
+              <w:right w:type="dxa" w:w="100"/>
+            </w:tcMar>
+          </w:tcPr>
+          <w:p>
+            <w:r>
+              <w:rPr>
+                <w:b w:val="false"/>
+                <w:bCs w:val="false"/>
+                <w:color w:val="24353A"/>
+                <w:sz w:val="17"/>
+                <w:szCs w:val="17"/>
+              </w:rPr>
+              <w:t xml:space="preserve"> </w:t>
+            </w:r>
+          </w:p>
+        </w:tc>
+        <w:tc>
+          <w:tcPr>
+            <w:tcW w:type="dxa" w:w="800"/>
+            <w:tcBorders>
+              <w:top w:val="single" w:color="D8E3E1" w:sz="2"/>
+              <w:left w:val="single" w:color="D8E3E1" w:sz="2"/>
+              <w:bottom w:val="single" w:color="D8E3E1" w:sz="2"/>
+              <w:right w:val="single" w:color="D8E3E1" w:sz="2"/>
+            </w:tcBorders>
+            <w:shd w:fill="FFFFFF" w:val="clear"/>
+            <w:tcMar>
+              <w:top w:type="dxa" w:w="90"/>
+              <w:left w:type="dxa" w:w="100"/>
+              <w:bottom w:type="dxa" w:w="90"/>
+              <w:right w:type="dxa" w:w="100"/>
+            </w:tcMar>
+          </w:tcPr>
+          <w:p>
+            <w:r>
+              <w:rPr>
+                <w:b w:val="false"/>
+                <w:bCs w:val="false"/>
+                <w:color w:val="24353A"/>
+                <w:sz w:val="17"/>
+                <w:szCs w:val="17"/>
+              </w:rPr>
+              <w:t xml:space="preserve"> </w:t>
+            </w:r>
+          </w:p>
+        </w:tc>
+        <w:tc>
+          <w:tcPr>
+            <w:tcW w:type="dxa" w:w="800"/>
+            <w:tcBorders>
+              <w:top w:val="single" w:color="D8E3E1" w:sz="2"/>
+              <w:left w:val="single" w:color="D8E3E1" w:sz="2"/>
+              <w:bottom w:val="single" w:color="D8E3E1" w:sz="2"/>
+              <w:right w:val="single" w:color="D8E3E1" w:sz="2"/>
+            </w:tcBorders>
+            <w:shd w:fill="FFFFFF" w:val="clear"/>
+            <w:tcMar>
+              <w:top w:type="dxa" w:w="90"/>
+              <w:left w:type="dxa" w:w="100"/>
+              <w:bottom w:type="dxa" w:w="90"/>
+              <w:right w:type="dxa" w:w="100"/>
+            </w:tcMar>
+          </w:tcPr>
+          <w:p>
+            <w:r>
+              <w:rPr>
+                <w:b w:val="false"/>
+                <w:bCs w:val="false"/>
+                <w:color w:val="24353A"/>
+                <w:sz w:val="17"/>
+                <w:szCs w:val="17"/>
+              </w:rPr>
+              <w:t xml:space="preserve"> </w:t>
+            </w:r>
+          </w:p>
+        </w:tc>
+        <w:tc>
+          <w:tcPr>
+            <w:tcW w:type="dxa" w:w="1000"/>
+            <w:tcBorders>
+              <w:top w:val="single" w:color="D8E3E1" w:sz="2"/>
+              <w:left w:val="single" w:color="D8E3E1" w:sz="2"/>
+              <w:bottom w:val="single" w:color="D8E3E1" w:sz="2"/>
+              <w:right w:val="single" w:color="D8E3E1" w:sz="2"/>
+            </w:tcBorders>
+            <w:shd w:fill="FFFFFF" w:val="clear"/>
+            <w:tcMar>
+              <w:top w:type="dxa" w:w="90"/>
+              <w:left w:type="dxa" w:w="100"/>
+              <w:bottom w:type="dxa" w:w="90"/>
+              <w:right w:type="dxa" w:w="100"/>
+            </w:tcMar>
+          </w:tcPr>
+          <w:p>
+            <w:r>
+              <w:rPr>
+                <w:b w:val="false"/>
+                <w:bCs w:val="false"/>
+                <w:color w:val="24353A"/>
+                <w:sz w:val="17"/>
+                <w:szCs w:val="17"/>
+              </w:rPr>
+              <w:t xml:space="preserve"> </w:t>
+            </w:r>
+          </w:p>
+        </w:tc>
+      </w:tr>
+      <w:tr>
+        <w:tc>
+          <w:tcPr>
+            <w:tcW w:type="dxa" w:w="2200"/>
+            <w:tcBorders>
+              <w:top w:val="single" w:color="D8E3E1" w:sz="2"/>
+              <w:left w:val="single" w:color="D8E3E1" w:sz="2"/>
+              <w:bottom w:val="single" w:color="D8E3E1" w:sz="2"/>
+              <w:right w:val="single" w:color="D8E3E1" w:sz="2"/>
+            </w:tcBorders>
+            <w:shd w:fill="FFFFFF" w:val="clear"/>
+            <w:tcMar>
+              <w:top w:type="dxa" w:w="90"/>
+              <w:left w:type="dxa" w:w="100"/>
+              <w:bottom w:type="dxa" w:w="90"/>
+              <w:right w:type="dxa" w:w="100"/>
+            </w:tcMar>
+          </w:tcPr>
+          <w:p>
+            <w:r>
+              <w:rPr>
+                <w:b w:val="false"/>
+                <w:bCs w:val="false"/>
+                <w:color w:val="24353A"/>
+                <w:sz w:val="17"/>
+                <w:szCs w:val="17"/>
+              </w:rPr>
+              <w:t xml:space="preserve">Animerco or nested player</w:t>
+            </w:r>
+          </w:p>
+        </w:tc>
+        <w:tc>
+          <w:tcPr>
+            <w:tcW w:type="dxa" w:w="900"/>
+            <w:tcBorders>
+              <w:top w:val="single" w:color="D8E3E1" w:sz="2"/>
+              <w:left w:val="single" w:color="D8E3E1" w:sz="2"/>
+              <w:bottom w:val="single" w:color="D8E3E1" w:sz="2"/>
+              <w:right w:val="single" w:color="D8E3E1" w:sz="2"/>
+            </w:tcBorders>
+            <w:shd w:fill="FFFFFF" w:val="clear"/>
+            <w:tcMar>
+              <w:top w:type="dxa" w:w="90"/>
+              <w:left w:type="dxa" w:w="100"/>
+              <w:bottom w:type="dxa" w:w="90"/>
+              <w:right w:type="dxa" w:w="100"/>
+            </w:tcMar>
+          </w:tcPr>
+          <w:p>
+            <w:r>
+              <w:rPr>
+                <w:b w:val="false"/>
+                <w:bCs w:val="false"/>
+                <w:color w:val="24353A"/>
+                <w:sz w:val="17"/>
+                <w:szCs w:val="17"/>
+              </w:rPr>
+              <w:t xml:space="preserve">Chrome</w:t>
+            </w:r>
+          </w:p>
+        </w:tc>
+        <w:tc>
+          <w:tcPr>
+            <w:tcW w:type="dxa" w:w="800"/>
+            <w:tcBorders>
+              <w:top w:val="single" w:color="D8E3E1" w:sz="2"/>
+              <w:left w:val="single" w:color="D8E3E1" w:sz="2"/>
+              <w:bottom w:val="single" w:color="D8E3E1" w:sz="2"/>
+              <w:right w:val="single" w:color="D8E3E1" w:sz="2"/>
+            </w:tcBorders>
+            <w:shd w:fill="FFFFFF" w:val="clear"/>
+            <w:tcMar>
+              <w:top w:type="dxa" w:w="90"/>
+              <w:left w:type="dxa" w:w="100"/>
+              <w:bottom w:type="dxa" w:w="90"/>
+              <w:right w:type="dxa" w:w="100"/>
+            </w:tcMar>
+          </w:tcPr>
+          <w:p>
+            <w:r>
+              <w:rPr>
+                <w:b w:val="false"/>
+                <w:bCs w:val="false"/>
+                <w:color w:val="24353A"/>
+                <w:sz w:val="17"/>
+                <w:szCs w:val="17"/>
+              </w:rPr>
+              <w:t xml:space="preserve"> </w:t>
+            </w:r>
+          </w:p>
+        </w:tc>
+        <w:tc>
+          <w:tcPr>
+            <w:tcW w:type="dxa" w:w="900"/>
+            <w:tcBorders>
+              <w:top w:val="single" w:color="D8E3E1" w:sz="2"/>
+              <w:left w:val="single" w:color="D8E3E1" w:sz="2"/>
+              <w:bottom w:val="single" w:color="D8E3E1" w:sz="2"/>
+              <w:right w:val="single" w:color="D8E3E1" w:sz="2"/>
+            </w:tcBorders>
+            <w:shd w:fill="FFFFFF" w:val="clear"/>
+            <w:tcMar>
+              <w:top w:type="dxa" w:w="90"/>
+              <w:left w:type="dxa" w:w="100"/>
+              <w:bottom w:type="dxa" w:w="90"/>
+              <w:right w:type="dxa" w:w="100"/>
+            </w:tcMar>
+          </w:tcPr>
+          <w:p>
+            <w:r>
+              <w:rPr>
+                <w:b w:val="false"/>
+                <w:bCs w:val="false"/>
+                <w:color w:val="24353A"/>
+                <w:sz w:val="17"/>
+                <w:szCs w:val="17"/>
+              </w:rPr>
+              <w:t xml:space="preserve"> </w:t>
+            </w:r>
+          </w:p>
+        </w:tc>
+        <w:tc>
+          <w:tcPr>
+            <w:tcW w:type="dxa" w:w="800"/>
+            <w:tcBorders>
+              <w:top w:val="single" w:color="D8E3E1" w:sz="2"/>
+              <w:left w:val="single" w:color="D8E3E1" w:sz="2"/>
+              <w:bottom w:val="single" w:color="D8E3E1" w:sz="2"/>
+              <w:right w:val="single" w:color="D8E3E1" w:sz="2"/>
+            </w:tcBorders>
+            <w:shd w:fill="FFFFFF" w:val="clear"/>
+            <w:tcMar>
+              <w:top w:type="dxa" w:w="90"/>
+              <w:left w:type="dxa" w:w="100"/>
+              <w:bottom w:type="dxa" w:w="90"/>
+              <w:right w:type="dxa" w:w="100"/>
+            </w:tcMar>
+          </w:tcPr>
+          <w:p>
+            <w:r>
+              <w:rPr>
+                <w:b w:val="false"/>
+                <w:bCs w:val="false"/>
+                <w:color w:val="24353A"/>
+                <w:sz w:val="17"/>
+                <w:szCs w:val="17"/>
+              </w:rPr>
+              <w:t xml:space="preserve"> </w:t>
+            </w:r>
+          </w:p>
+        </w:tc>
+        <w:tc>
+          <w:tcPr>
+            <w:tcW w:type="dxa" w:w="800"/>
+            <w:tcBorders>
+              <w:top w:val="single" w:color="D8E3E1" w:sz="2"/>
+              <w:left w:val="single" w:color="D8E3E1" w:sz="2"/>
+              <w:bottom w:val="single" w:color="D8E3E1" w:sz="2"/>
+              <w:right w:val="single" w:color="D8E3E1" w:sz="2"/>
+            </w:tcBorders>
+            <w:shd w:fill="FFFFFF" w:val="clear"/>
+            <w:tcMar>
+              <w:top w:type="dxa" w:w="90"/>
+              <w:left w:type="dxa" w:w="100"/>
+              <w:bottom w:type="dxa" w:w="90"/>
+              <w:right w:type="dxa" w:w="100"/>
+            </w:tcMar>
+          </w:tcPr>
+          <w:p>
+            <w:r>
+              <w:rPr>
+                <w:b w:val="false"/>
+                <w:bCs w:val="false"/>
+                <w:color w:val="24353A"/>
+                <w:sz w:val="17"/>
+                <w:szCs w:val="17"/>
+              </w:rPr>
+              <w:t xml:space="preserve"> </w:t>
+            </w:r>
+          </w:p>
+        </w:tc>
+        <w:tc>
+          <w:tcPr>
+            <w:tcW w:type="dxa" w:w="800"/>
+            <w:tcBorders>
+              <w:top w:val="single" w:color="D8E3E1" w:sz="2"/>
+              <w:left w:val="single" w:color="D8E3E1" w:sz="2"/>
+              <w:bottom w:val="single" w:color="D8E3E1" w:sz="2"/>
+              <w:right w:val="single" w:color="D8E3E1" w:sz="2"/>
+            </w:tcBorders>
+            <w:shd w:fill="FFFFFF" w:val="clear"/>
+            <w:tcMar>
+              <w:top w:type="dxa" w:w="90"/>
+              <w:left w:type="dxa" w:w="100"/>
+              <w:bottom w:type="dxa" w:w="90"/>
+              <w:right w:type="dxa" w:w="100"/>
+            </w:tcMar>
+          </w:tcPr>
+          <w:p>
+            <w:r>
+              <w:rPr>
+                <w:b w:val="false"/>
+                <w:bCs w:val="false"/>
+                <w:color w:val="24353A"/>
+                <w:sz w:val="17"/>
+                <w:szCs w:val="17"/>
+              </w:rPr>
+              <w:t xml:space="preserve"> </w:t>
+            </w:r>
+          </w:p>
+        </w:tc>
+        <w:tc>
+          <w:tcPr>
+            <w:tcW w:type="dxa" w:w="1000"/>
+            <w:tcBorders>
+              <w:top w:val="single" w:color="D8E3E1" w:sz="2"/>
+              <w:left w:val="single" w:color="D8E3E1" w:sz="2"/>
+              <w:bottom w:val="single" w:color="D8E3E1" w:sz="2"/>
+              <w:right w:val="single" w:color="D8E3E1" w:sz="2"/>
+            </w:tcBorders>
+            <w:shd w:fill="FFFFFF" w:val="clear"/>
+            <w:tcMar>
+              <w:top w:type="dxa" w:w="90"/>
+              <w:left w:type="dxa" w:w="100"/>
+              <w:bottom w:type="dxa" w:w="90"/>
+              <w:right w:type="dxa" w:w="100"/>
+            </w:tcMar>
+          </w:tcPr>
+          <w:p>
+            <w:r>
+              <w:rPr>
+                <w:b w:val="false"/>
+                <w:bCs w:val="false"/>
+                <w:color w:val="24353A"/>
+                <w:sz w:val="17"/>
+                <w:szCs w:val="17"/>
+              </w:rPr>
+              <w:t xml:space="preserve"> </w:t>
+            </w:r>
+          </w:p>
+        </w:tc>
+      </w:tr>
+      <w:tr>
+        <w:tc>
+          <w:tcPr>
+            <w:tcW w:type="dxa" w:w="2200"/>
+            <w:tcBorders>
+              <w:top w:val="single" w:color="D8E3E1" w:sz="2"/>
+              <w:left w:val="single" w:color="D8E3E1" w:sz="2"/>
+              <w:bottom w:val="single" w:color="D8E3E1" w:sz="2"/>
+              <w:right w:val="single" w:color="D8E3E1" w:sz="2"/>
+            </w:tcBorders>
+            <w:shd w:fill="FFFFFF" w:val="clear"/>
+            <w:tcMar>
+              <w:top w:type="dxa" w:w="90"/>
+              <w:left w:type="dxa" w:w="100"/>
+              <w:bottom w:type="dxa" w:w="90"/>
+              <w:right w:type="dxa" w:w="100"/>
+            </w:tcMar>
+          </w:tcPr>
+          <w:p>
+            <w:r>
+              <w:rPr>
+                <w:b w:val="false"/>
+                <w:bCs w:val="false"/>
+                <w:color w:val="24353A"/>
+                <w:sz w:val="17"/>
+                <w:szCs w:val="17"/>
+              </w:rPr>
+              <w:t xml:space="preserve">Qfilm or cross-origin player</w:t>
+            </w:r>
+          </w:p>
+        </w:tc>
+        <w:tc>
+          <w:tcPr>
+            <w:tcW w:type="dxa" w:w="900"/>
+            <w:tcBorders>
+              <w:top w:val="single" w:color="D8E3E1" w:sz="2"/>
+              <w:left w:val="single" w:color="D8E3E1" w:sz="2"/>
+              <w:bottom w:val="single" w:color="D8E3E1" w:sz="2"/>
+              <w:right w:val="single" w:color="D8E3E1" w:sz="2"/>
+            </w:tcBorders>
+            <w:shd w:fill="FFFFFF" w:val="clear"/>
+            <w:tcMar>
+              <w:top w:type="dxa" w:w="90"/>
+              <w:left w:type="dxa" w:w="100"/>
+              <w:bottom w:type="dxa" w:w="90"/>
+              <w:right w:type="dxa" w:w="100"/>
+            </w:tcMar>
+          </w:tcPr>
+          <w:p>
+            <w:r>
+              <w:rPr>
+                <w:b w:val="false"/>
+                <w:bCs w:val="false"/>
+                <w:color w:val="24353A"/>
+                <w:sz w:val="17"/>
+                <w:szCs w:val="17"/>
+              </w:rPr>
+              <w:t xml:space="preserve">Chrome</w:t>
+            </w:r>
+          </w:p>
+        </w:tc>
+        <w:tc>
+          <w:tcPr>
+            <w:tcW w:type="dxa" w:w="800"/>
+            <w:tcBorders>
+              <w:top w:val="single" w:color="D8E3E1" w:sz="2"/>
+              <w:left w:val="single" w:color="D8E3E1" w:sz="2"/>
+              <w:bottom w:val="single" w:color="D8E3E1" w:sz="2"/>
+              <w:right w:val="single" w:color="D8E3E1" w:sz="2"/>
+            </w:tcBorders>
+            <w:shd w:fill="FFFFFF" w:val="clear"/>
+            <w:tcMar>
+              <w:top w:type="dxa" w:w="90"/>
+              <w:left w:type="dxa" w:w="100"/>
+              <w:bottom w:type="dxa" w:w="90"/>
+              <w:right w:type="dxa" w:w="100"/>
+            </w:tcMar>
+          </w:tcPr>
+          <w:p>
+            <w:r>
+              <w:rPr>
+                <w:b w:val="false"/>
+                <w:bCs w:val="false"/>
+                <w:color w:val="24353A"/>
+                <w:sz w:val="17"/>
+                <w:szCs w:val="17"/>
+              </w:rPr>
+              <w:t xml:space="preserve"> </w:t>
+            </w:r>
+          </w:p>
+        </w:tc>
+        <w:tc>
+          <w:tcPr>
+            <w:tcW w:type="dxa" w:w="900"/>
+            <w:tcBorders>
+              <w:top w:val="single" w:color="D8E3E1" w:sz="2"/>
+              <w:left w:val="single" w:color="D8E3E1" w:sz="2"/>
+              <w:bottom w:val="single" w:color="D8E3E1" w:sz="2"/>
+              <w:right w:val="single" w:color="D8E3E1" w:sz="2"/>
+            </w:tcBorders>
+            <w:shd w:fill="FFFFFF" w:val="clear"/>
+            <w:tcMar>
+              <w:top w:type="dxa" w:w="90"/>
+              <w:left w:type="dxa" w:w="100"/>
+              <w:bottom w:type="dxa" w:w="90"/>
+              <w:right w:type="dxa" w:w="100"/>
+            </w:tcMar>
+          </w:tcPr>
+          <w:p>
+            <w:r>
+              <w:rPr>
+                <w:b w:val="false"/>
+                <w:bCs w:val="false"/>
+                <w:color w:val="24353A"/>
+                <w:sz w:val="17"/>
+                <w:szCs w:val="17"/>
+              </w:rPr>
+              <w:t xml:space="preserve"> </w:t>
+            </w:r>
+          </w:p>
+        </w:tc>
+        <w:tc>
+          <w:tcPr>
+            <w:tcW w:type="dxa" w:w="800"/>
+            <w:tcBorders>
+              <w:top w:val="single" w:color="D8E3E1" w:sz="2"/>
+              <w:left w:val="single" w:color="D8E3E1" w:sz="2"/>
+              <w:bottom w:val="single" w:color="D8E3E1" w:sz="2"/>
+              <w:right w:val="single" w:color="D8E3E1" w:sz="2"/>
+            </w:tcBorders>
+            <w:shd w:fill="FFFFFF" w:val="clear"/>
+            <w:tcMar>
+              <w:top w:type="dxa" w:w="90"/>
+              <w:left w:type="dxa" w:w="100"/>
+              <w:bottom w:type="dxa" w:w="90"/>
+              <w:right w:type="dxa" w:w="100"/>
+            </w:tcMar>
+          </w:tcPr>
+          <w:p>
+            <w:r>
+              <w:rPr>
+                <w:b w:val="false"/>
+                <w:bCs w:val="false"/>
+                <w:color w:val="24353A"/>
+                <w:sz w:val="17"/>
+                <w:szCs w:val="17"/>
+              </w:rPr>
+              <w:t xml:space="preserve"> </w:t>
+            </w:r>
+          </w:p>
+        </w:tc>
+        <w:tc>
+          <w:tcPr>
+            <w:tcW w:type="dxa" w:w="800"/>
+            <w:tcBorders>
+              <w:top w:val="single" w:color="D8E3E1" w:sz="2"/>
+              <w:left w:val="single" w:color="D8E3E1" w:sz="2"/>
+              <w:bottom w:val="single" w:color="D8E3E1" w:sz="2"/>
+              <w:right w:val="single" w:color="D8E3E1" w:sz="2"/>
+            </w:tcBorders>
+            <w:shd w:fill="FFFFFF" w:val="clear"/>
+            <w:tcMar>
+              <w:top w:type="dxa" w:w="90"/>
+              <w:left w:type="dxa" w:w="100"/>
+              <w:bottom w:type="dxa" w:w="90"/>
+              <w:right w:type="dxa" w:w="100"/>
+            </w:tcMar>
+          </w:tcPr>
+          <w:p>
+            <w:r>
+              <w:rPr>
+                <w:b w:val="false"/>
+                <w:bCs w:val="false"/>
+                <w:color w:val="24353A"/>
+                <w:sz w:val="17"/>
+                <w:szCs w:val="17"/>
+              </w:rPr>
+              <w:t xml:space="preserve"> </w:t>
+            </w:r>
+          </w:p>
+        </w:tc>
+        <w:tc>
+          <w:tcPr>
+            <w:tcW w:type="dxa" w:w="800"/>
+            <w:tcBorders>
+              <w:top w:val="single" w:color="D8E3E1" w:sz="2"/>
+              <w:left w:val="single" w:color="D8E3E1" w:sz="2"/>
+              <w:bottom w:val="single" w:color="D8E3E1" w:sz="2"/>
+              <w:right w:val="single" w:color="D8E3E1" w:sz="2"/>
+            </w:tcBorders>
+            <w:shd w:fill="FFFFFF" w:val="clear"/>
+            <w:tcMar>
+              <w:top w:type="dxa" w:w="90"/>
+              <w:left w:type="dxa" w:w="100"/>
+              <w:bottom w:type="dxa" w:w="90"/>
+              <w:right w:type="dxa" w:w="100"/>
+            </w:tcMar>
+          </w:tcPr>
+          <w:p>
+            <w:r>
+              <w:rPr>
+                <w:b w:val="false"/>
+                <w:bCs w:val="false"/>
+                <w:color w:val="24353A"/>
+                <w:sz w:val="17"/>
+                <w:szCs w:val="17"/>
+              </w:rPr>
+              <w:t xml:space="preserve"> </w:t>
+            </w:r>
+          </w:p>
+        </w:tc>
+        <w:tc>
+          <w:tcPr>
+            <w:tcW w:type="dxa" w:w="1000"/>
+            <w:tcBorders>
+              <w:top w:val="single" w:color="D8E3E1" w:sz="2"/>
+              <w:left w:val="single" w:color="D8E3E1" w:sz="2"/>
+              <w:bottom w:val="single" w:color="D8E3E1" w:sz="2"/>
+              <w:right w:val="single" w:color="D8E3E1" w:sz="2"/>
+            </w:tcBorders>
+            <w:shd w:fill="FFFFFF" w:val="clear"/>
+            <w:tcMar>
+              <w:top w:type="dxa" w:w="90"/>
+              <w:left w:type="dxa" w:w="100"/>
+              <w:bottom w:type="dxa" w:w="90"/>
+              <w:right w:type="dxa" w:w="100"/>
+            </w:tcMar>
+          </w:tcPr>
+          <w:p>
+            <w:r>
+              <w:rPr>
+                <w:b w:val="false"/>
+                <w:bCs w:val="false"/>
+                <w:color w:val="24353A"/>
+                <w:sz w:val="17"/>
+                <w:szCs w:val="17"/>
+              </w:rPr>
+              <w:t xml:space="preserve"> </w:t>
+            </w:r>
+          </w:p>
+        </w:tc>
+      </w:tr>
+      <w:tr>
+        <w:tc>
+          <w:tcPr>
+            <w:tcW w:type="dxa" w:w="2200"/>
+            <w:tcBorders>
+              <w:top w:val="single" w:color="D8E3E1" w:sz="2"/>
+              <w:left w:val="single" w:color="D8E3E1" w:sz="2"/>
+              <w:bottom w:val="single" w:color="D8E3E1" w:sz="2"/>
+              <w:right w:val="single" w:color="D8E3E1" w:sz="2"/>
+            </w:tcBorders>
+            <w:shd w:fill="FFFFFF" w:val="clear"/>
+            <w:tcMar>
+              <w:top w:type="dxa" w:w="90"/>
+              <w:left w:type="dxa" w:w="100"/>
+              <w:bottom w:type="dxa" w:w="90"/>
+              <w:right w:type="dxa" w:w="100"/>
+            </w:tcMar>
+          </w:tcPr>
+          <w:p>
+            <w:r>
+              <w:rPr>
+                <w:b w:val="false"/>
+                <w:bCs w:val="false"/>
+                <w:color w:val="24353A"/>
+                <w:sz w:val="17"/>
+                <w:szCs w:val="17"/>
+              </w:rPr>
+              <w:t xml:space="preserve">Selected provider</w:t>
+            </w:r>
+          </w:p>
+        </w:tc>
+        <w:tc>
+          <w:tcPr>
+            <w:tcW w:type="dxa" w:w="900"/>
+            <w:tcBorders>
+              <w:top w:val="single" w:color="D8E3E1" w:sz="2"/>
+              <w:left w:val="single" w:color="D8E3E1" w:sz="2"/>
+              <w:bottom w:val="single" w:color="D8E3E1" w:sz="2"/>
+              <w:right w:val="single" w:color="D8E3E1" w:sz="2"/>
+            </w:tcBorders>
+            <w:shd w:fill="FFFFFF" w:val="clear"/>
+            <w:tcMar>
+              <w:top w:type="dxa" w:w="90"/>
+              <w:left w:type="dxa" w:w="100"/>
+              <w:bottom w:type="dxa" w:w="90"/>
+              <w:right w:type="dxa" w:w="100"/>
+            </w:tcMar>
+          </w:tcPr>
+          <w:p>
+            <w:r>
+              <w:rPr>
+                <w:b w:val="false"/>
+                <w:bCs w:val="false"/>
+                <w:color w:val="24353A"/>
+                <w:sz w:val="17"/>
+                <w:szCs w:val="17"/>
+              </w:rPr>
+              <w:t xml:space="preserve">Firefox</w:t>
+            </w:r>
+          </w:p>
+        </w:tc>
+        <w:tc>
+          <w:tcPr>
+            <w:tcW w:type="dxa" w:w="800"/>
+            <w:tcBorders>
+              <w:top w:val="single" w:color="D8E3E1" w:sz="2"/>
+              <w:left w:val="single" w:color="D8E3E1" w:sz="2"/>
+              <w:bottom w:val="single" w:color="D8E3E1" w:sz="2"/>
+              <w:right w:val="single" w:color="D8E3E1" w:sz="2"/>
+            </w:tcBorders>
+            <w:shd w:fill="FFFFFF" w:val="clear"/>
+            <w:tcMar>
+              <w:top w:type="dxa" w:w="90"/>
+              <w:left w:type="dxa" w:w="100"/>
+              <w:bottom w:type="dxa" w:w="90"/>
+              <w:right w:type="dxa" w:w="100"/>
+            </w:tcMar>
+          </w:tcPr>
+          <w:p>
+            <w:r>
+              <w:rPr>
+                <w:b w:val="false"/>
+                <w:bCs w:val="false"/>
+                <w:color w:val="24353A"/>
+                <w:sz w:val="17"/>
+                <w:szCs w:val="17"/>
+              </w:rPr>
+              <w:t xml:space="preserve"> </w:t>
+            </w:r>
+          </w:p>
+        </w:tc>
+        <w:tc>
+          <w:tcPr>
+            <w:tcW w:type="dxa" w:w="900"/>
+            <w:tcBorders>
+              <w:top w:val="single" w:color="D8E3E1" w:sz="2"/>
+              <w:left w:val="single" w:color="D8E3E1" w:sz="2"/>
+              <w:bottom w:val="single" w:color="D8E3E1" w:sz="2"/>
+              <w:right w:val="single" w:color="D8E3E1" w:sz="2"/>
+            </w:tcBorders>
+            <w:shd w:fill="FFFFFF" w:val="clear"/>
+            <w:tcMar>
+              <w:top w:type="dxa" w:w="90"/>
+              <w:left w:type="dxa" w:w="100"/>
+              <w:bottom w:type="dxa" w:w="90"/>
+              <w:right w:type="dxa" w:w="100"/>
+            </w:tcMar>
+          </w:tcPr>
+          <w:p>
+            <w:r>
+              <w:rPr>
+                <w:b w:val="false"/>
+                <w:bCs w:val="false"/>
+                <w:color w:val="24353A"/>
+                <w:sz w:val="17"/>
+                <w:szCs w:val="17"/>
+              </w:rPr>
+              <w:t xml:space="preserve"> </w:t>
+            </w:r>
+          </w:p>
+        </w:tc>
+        <w:tc>
+          <w:tcPr>
+            <w:tcW w:type="dxa" w:w="800"/>
+            <w:tcBorders>
+              <w:top w:val="single" w:color="D8E3E1" w:sz="2"/>
+              <w:left w:val="single" w:color="D8E3E1" w:sz="2"/>
+              <w:bottom w:val="single" w:color="D8E3E1" w:sz="2"/>
+              <w:right w:val="single" w:color="D8E3E1" w:sz="2"/>
+            </w:tcBorders>
+            <w:shd w:fill="FFFFFF" w:val="clear"/>
+            <w:tcMar>
+              <w:top w:type="dxa" w:w="90"/>
+              <w:left w:type="dxa" w:w="100"/>
+              <w:bottom w:type="dxa" w:w="90"/>
+              <w:right w:type="dxa" w:w="100"/>
+            </w:tcMar>
+          </w:tcPr>
+          <w:p>
+            <w:r>
+              <w:rPr>
+                <w:b w:val="false"/>
+                <w:bCs w:val="false"/>
+                <w:color w:val="24353A"/>
+                <w:sz w:val="17"/>
+                <w:szCs w:val="17"/>
+              </w:rPr>
+              <w:t xml:space="preserve"> </w:t>
+            </w:r>
+          </w:p>
+        </w:tc>
+        <w:tc>
+          <w:tcPr>
+            <w:tcW w:type="dxa" w:w="800"/>
+            <w:tcBorders>
+              <w:top w:val="single" w:color="D8E3E1" w:sz="2"/>
+              <w:left w:val="single" w:color="D8E3E1" w:sz="2"/>
+              <w:bottom w:val="single" w:color="D8E3E1" w:sz="2"/>
+              <w:right w:val="single" w:color="D8E3E1" w:sz="2"/>
+            </w:tcBorders>
+            <w:shd w:fill="FFFFFF" w:val="clear"/>
+            <w:tcMar>
+              <w:top w:type="dxa" w:w="90"/>
+              <w:left w:type="dxa" w:w="100"/>
+              <w:bottom w:type="dxa" w:w="90"/>
+              <w:right w:type="dxa" w:w="100"/>
+            </w:tcMar>
+          </w:tcPr>
+          <w:p>
+            <w:r>
+              <w:rPr>
+                <w:b w:val="false"/>
+                <w:bCs w:val="false"/>
+                <w:color w:val="24353A"/>
+                <w:sz w:val="17"/>
+                <w:szCs w:val="17"/>
+              </w:rPr>
+              <w:t xml:space="preserve"> </w:t>
+            </w:r>
+          </w:p>
+        </w:tc>
+        <w:tc>
+          <w:tcPr>
+            <w:tcW w:type="dxa" w:w="800"/>
+            <w:tcBorders>
+              <w:top w:val="single" w:color="D8E3E1" w:sz="2"/>
+              <w:left w:val="single" w:color="D8E3E1" w:sz="2"/>
+              <w:bottom w:val="single" w:color="D8E3E1" w:sz="2"/>
+              <w:right w:val="single" w:color="D8E3E1" w:sz="2"/>
+            </w:tcBorders>
+            <w:shd w:fill="FFFFFF" w:val="clear"/>
+            <w:tcMar>
+              <w:top w:type="dxa" w:w="90"/>
+              <w:left w:type="dxa" w:w="100"/>
+              <w:bottom w:type="dxa" w:w="90"/>
+              <w:right w:type="dxa" w:w="100"/>
+            </w:tcMar>
+          </w:tcPr>
+          <w:p>
+            <w:r>
+              <w:rPr>
+                <w:b w:val="false"/>
+                <w:bCs w:val="false"/>
+                <w:color w:val="24353A"/>
+                <w:sz w:val="17"/>
+                <w:szCs w:val="17"/>
+              </w:rPr>
+              <w:t xml:space="preserve"> </w:t>
+            </w:r>
+          </w:p>
+        </w:tc>
+        <w:tc>
+          <w:tcPr>
+            <w:tcW w:type="dxa" w:w="1000"/>
+            <w:tcBorders>
+              <w:top w:val="single" w:color="D8E3E1" w:sz="2"/>
+              <w:left w:val="single" w:color="D8E3E1" w:sz="2"/>
+              <w:bottom w:val="single" w:color="D8E3E1" w:sz="2"/>
+              <w:right w:val="single" w:color="D8E3E1" w:sz="2"/>
+            </w:tcBorders>
+            <w:shd w:fill="FFFFFF" w:val="clear"/>
+            <w:tcMar>
+              <w:top w:type="dxa" w:w="90"/>
+              <w:left w:type="dxa" w:w="100"/>
+              <w:bottom w:type="dxa" w:w="90"/>
+              <w:right w:type="dxa" w:w="100"/>
+            </w:tcMar>
+          </w:tcPr>
+          <w:p>
+            <w:r>
+              <w:rPr>
+                <w:b w:val="false"/>
+                <w:bCs w:val="false"/>
+                <w:color w:val="24353A"/>
+                <w:sz w:val="17"/>
+                <w:szCs w:val="17"/>
+              </w:rPr>
+              <w:t xml:space="preserve"> </w:t>
+            </w:r>
+          </w:p>
+        </w:tc>
+      </w:tr>
+    </w:tbl>
     <w:p>
       <w:pPr>
         <w:pStyle w:val="Heading1"/>
@@ -1757,194 +3722,139 @@
         <w:rPr>
           <w:color w:val="0F766E"/>
         </w:rPr>
-        <w:t xml:space="preserve">12. Record every issue</w:t>
-      </w:r>
-    </w:p>
-    <w:p>
-      <w:pPr>
-        <w:pStyle w:val="ListParagraph"/>
-        <w:numPr>
-          <w:ilvl w:val="0"/>
-          <w:numId w:val="2"/>
-        </w:numPr>
-        <w:spacing w:after="45"/>
-      </w:pPr>
-      <w:r>
-        <w:rPr>
-          <w:sz w:val="19"/>
-          <w:szCs w:val="19"/>
-        </w:rPr>
-        <w:t xml:space="preserve">Test letter and step.</w:t>
-      </w:r>
-    </w:p>
-    <w:p>
-      <w:pPr>
-        <w:pStyle w:val="ListParagraph"/>
-        <w:numPr>
-          <w:ilvl w:val="0"/>
-          <w:numId w:val="2"/>
-        </w:numPr>
-        <w:spacing w:after="45"/>
-      </w:pPr>
-      <w:r>
-        <w:rPr>
-          <w:sz w:val="19"/>
-          <w:szCs w:val="19"/>
-        </w:rPr>
-        <w:t xml:space="preserve">Provider and exact page type.</w:t>
-      </w:r>
-    </w:p>
-    <w:p>
-      <w:pPr>
-        <w:pStyle w:val="ListParagraph"/>
-        <w:numPr>
-          <w:ilvl w:val="0"/>
-          <w:numId w:val="2"/>
-        </w:numPr>
-        <w:spacing w:after="45"/>
-      </w:pPr>
-      <w:r>
-        <w:rPr>
-          <w:sz w:val="19"/>
-          <w:szCs w:val="19"/>
-        </w:rPr>
-        <w:t xml:space="preserve">Host or guest.</w:t>
-      </w:r>
-    </w:p>
-    <w:p>
-      <w:pPr>
-        <w:pStyle w:val="ListParagraph"/>
-        <w:numPr>
-          <w:ilvl w:val="0"/>
-          <w:numId w:val="2"/>
-        </w:numPr>
-        <w:spacing w:after="45"/>
-      </w:pPr>
-      <w:r>
-        <w:rPr>
-          <w:sz w:val="19"/>
-          <w:szCs w:val="19"/>
-        </w:rPr>
-        <w:t xml:space="preserve">Browser and version.</w:t>
-      </w:r>
-    </w:p>
-    <w:p>
-      <w:pPr>
-        <w:pStyle w:val="ListParagraph"/>
-        <w:numPr>
-          <w:ilvl w:val="0"/>
-          <w:numId w:val="2"/>
-        </w:numPr>
-        <w:spacing w:after="45"/>
-      </w:pPr>
-      <w:r>
-        <w:rPr>
-          <w:sz w:val="19"/>
-          <w:szCs w:val="19"/>
-        </w:rPr>
-        <w:t xml:space="preserve">Operating system.</w:t>
-      </w:r>
-    </w:p>
-    <w:p>
-      <w:pPr>
-        <w:pStyle w:val="ListParagraph"/>
-        <w:numPr>
-          <w:ilvl w:val="0"/>
-          <w:numId w:val="2"/>
-        </w:numPr>
-        <w:spacing w:after="45"/>
-      </w:pPr>
-      <w:r>
-        <w:rPr>
-          <w:sz w:val="19"/>
-          <w:szCs w:val="19"/>
-        </w:rPr>
-        <w:t xml:space="preserve">Side-panel status and RTT.</w:t>
-      </w:r>
-    </w:p>
-    <w:p>
-      <w:pPr>
-        <w:pStyle w:val="ListParagraph"/>
-        <w:numPr>
-          <w:ilvl w:val="0"/>
-          <w:numId w:val="2"/>
-        </w:numPr>
-        <w:spacing w:after="45"/>
-      </w:pPr>
-      <w:r>
-        <w:rPr>
-          <w:sz w:val="19"/>
-          <w:szCs w:val="19"/>
-        </w:rPr>
-        <w:t xml:space="preserve">Whether readiness changed unexpectedly.</w:t>
-      </w:r>
-    </w:p>
-    <w:p>
-      <w:pPr>
-        <w:pStyle w:val="ListParagraph"/>
-        <w:numPr>
-          <w:ilvl w:val="0"/>
-          <w:numId w:val="2"/>
-        </w:numPr>
-        <w:spacing w:after="45"/>
-      </w:pPr>
-      <w:r>
-        <w:rPr>
-          <w:sz w:val="19"/>
-          <w:szCs w:val="19"/>
-        </w:rPr>
-        <w:t xml:space="preserve">Whether the room clock moved while the local video was stopped.</w:t>
-      </w:r>
-    </w:p>
-    <w:p>
-      <w:pPr>
-        <w:pStyle w:val="ListParagraph"/>
-        <w:numPr>
-          <w:ilvl w:val="0"/>
-          <w:numId w:val="2"/>
-        </w:numPr>
-        <w:spacing w:after="45"/>
-      </w:pPr>
-      <w:r>
-        <w:rPr>
-          <w:sz w:val="19"/>
-          <w:szCs w:val="19"/>
-        </w:rPr>
-        <w:t xml:space="preserve">Whether a refresh was required.</w:t>
-      </w:r>
-    </w:p>
-    <w:p>
-      <w:pPr>
-        <w:pStyle w:val="ListParagraph"/>
-        <w:numPr>
-          <w:ilvl w:val="0"/>
-          <w:numId w:val="2"/>
-        </w:numPr>
-        <w:spacing w:after="45"/>
-      </w:pPr>
-      <w:r>
-        <w:rPr>
-          <w:sz w:val="19"/>
-          <w:szCs w:val="19"/>
-        </w:rPr>
-        <w:t xml:space="preserve">Detailed-report filename.</w:t>
-      </w:r>
-    </w:p>
-    <w:p>
-      <w:pPr>
-        <w:pStyle w:val="ListParagraph"/>
-        <w:numPr>
-          <w:ilvl w:val="0"/>
-          <w:numId w:val="2"/>
-        </w:numPr>
-        <w:spacing w:after="45"/>
-      </w:pPr>
-      <w:r>
-        <w:rPr>
-          <w:sz w:val="19"/>
-          <w:szCs w:val="19"/>
-        </w:rPr>
-        <w:t xml:space="preserve">A short description without account or payment information.</w:t>
+        <w:t xml:space="preserve">13. Download the detailed report</w:t>
+      </w:r>
+    </w:p>
+    <w:p>
+      <w:pPr>
+        <w:pStyle w:val="ListParagraph"/>
+        <w:numPr>
+          <w:ilvl w:val="0"/>
+          <w:numId w:val="3"/>
+        </w:numPr>
+        <w:spacing w:after="45"/>
+      </w:pPr>
+      <w:r>
+        <w:rPr>
+          <w:sz w:val="19"/>
+          <w:szCs w:val="19"/>
+        </w:rPr>
+        <w:t xml:space="preserve">Only the room controller can collect the room-wide report.</w:t>
+      </w:r>
+    </w:p>
+    <w:p>
+      <w:pPr>
+        <w:pStyle w:val="ListParagraph"/>
+        <w:numPr>
+          <w:ilvl w:val="0"/>
+          <w:numId w:val="3"/>
+        </w:numPr>
+        <w:spacing w:after="45"/>
+      </w:pPr>
+      <w:r>
+        <w:rPr>
+          <w:sz w:val="19"/>
+          <w:szCs w:val="19"/>
+        </w:rPr>
+        <w:t xml:space="preserve">Open the side panel while the room is connected.</w:t>
+      </w:r>
+    </w:p>
+    <w:p>
+      <w:pPr>
+        <w:pStyle w:val="ListParagraph"/>
+        <w:numPr>
+          <w:ilvl w:val="0"/>
+          <w:numId w:val="3"/>
+        </w:numPr>
+        <w:spacing w:after="45"/>
+      </w:pPr>
+      <w:r>
+        <w:rPr>
+          <w:sz w:val="19"/>
+          <w:szCs w:val="19"/>
+        </w:rPr>
+        <w:t xml:space="preserve">Find Beta diagnostics and select Download detailed report.</w:t>
+      </w:r>
+    </w:p>
+    <w:p>
+      <w:pPr>
+        <w:pStyle w:val="ListParagraph"/>
+        <w:numPr>
+          <w:ilvl w:val="0"/>
+          <w:numId w:val="3"/>
+        </w:numPr>
+        <w:spacing w:after="45"/>
+      </w:pPr>
+      <w:r>
+        <w:rPr>
+          <w:sz w:val="19"/>
+          <w:szCs w:val="19"/>
+        </w:rPr>
+        <w:t xml:space="preserve">Wait for the JSON file to download.</w:t>
+      </w:r>
+    </w:p>
+    <w:p>
+      <w:pPr>
+        <w:pStyle w:val="ListParagraph"/>
+        <w:numPr>
+          <w:ilvl w:val="0"/>
+          <w:numId w:val="3"/>
+        </w:numPr>
+        <w:spacing w:after="45"/>
+      </w:pPr>
+      <w:r>
+        <w:rPr>
+          <w:sz w:val="19"/>
+          <w:szCs w:val="19"/>
+        </w:rPr>
+        <w:t xml:space="preserve">Keep the report with the exact test step and time of the failure.</w:t>
+      </w:r>
+    </w:p>
+    <w:p>
+      <w:pPr>
+        <w:pStyle w:val="ListParagraph"/>
+        <w:numPr>
+          <w:ilvl w:val="0"/>
+          <w:numId w:val="3"/>
+        </w:numPr>
+        <w:spacing w:after="45"/>
+      </w:pPr>
+      <w:r>
+        <w:rPr>
+          <w:sz w:val="19"/>
+          <w:szCs w:val="19"/>
+        </w:rPr>
+        <w:t xml:space="preserve">Review the report before sharing. Do not attach unrelated private files.</w:t>
+      </w:r>
+    </w:p>
+    <w:p>
+      <w:pPr>
+        <w:spacing w:after="100"/>
+      </w:pPr>
+      <w:r>
+        <w:rPr>
+          <w:b w:val="false"/>
+          <w:bCs w:val="false"/>
+          <w:color w:val="24353A"/>
+          <w:sz w:val="20"/>
+          <w:szCs w:val="20"/>
+        </w:rPr>
+        <w:t xml:space="preserve">The report is testing-only. It is designed to exclude passwords, cookies, media bytes, audio, screenshots, and URL query parameters.</w:t>
+      </w:r>
+    </w:p>
+    <w:p>
+      <w:pPr>
+        <w:spacing w:after="100"/>
+      </w:pPr>
+      <w:r>
+        <w:rPr>
+          <w:b w:val="false"/>
+          <w:bCs w:val="false"/>
+          <w:color w:val="52656D"/>
+          <w:sz w:val="20"/>
+          <w:szCs w:val="20"/>
+        </w:rPr>
+        <w:t xml:space="preserve">If the failure involves seeking, download the report before refreshing either tab. Include whether the side-panel seconds changed, whether the native video time changed, and whether the video rendered new frames.</w:t>
       </w:r>
     </w:p>
     <w:p>
@@ -1956,7 +3866,354 @@
         <w:rPr>
           <w:color w:val="0F766E"/>
         </w:rPr>
-        <w:t xml:space="preserve">13. Pass/fail worksheet</w:t>
+        <w:t xml:space="preserve">14. Fast recovery when a video is not progressing</w:t>
+      </w:r>
+    </w:p>
+    <w:p>
+      <w:pPr>
+        <w:pStyle w:val="ListParagraph"/>
+        <w:numPr>
+          <w:ilvl w:val="0"/>
+          <w:numId w:val="3"/>
+        </w:numPr>
+        <w:spacing w:after="45"/>
+      </w:pPr>
+      <w:r>
+        <w:rPr>
+          <w:sz w:val="19"/>
+          <w:szCs w:val="19"/>
+        </w:rPr>
+        <w:t xml:space="preserve">Confirm the affected tab still shows the intended video and native controls.</w:t>
+      </w:r>
+    </w:p>
+    <w:p>
+      <w:pPr>
+        <w:pStyle w:val="ListParagraph"/>
+        <w:numPr>
+          <w:ilvl w:val="0"/>
+          <w:numId w:val="3"/>
+        </w:numPr>
+        <w:spacing w:after="45"/>
+      </w:pPr>
+      <w:r>
+        <w:rPr>
+          <w:sz w:val="19"/>
+          <w:szCs w:val="19"/>
+        </w:rPr>
+        <w:t xml:space="preserve">Click the video once if the browser may have blocked script-initiated playback.</w:t>
+      </w:r>
+    </w:p>
+    <w:p>
+      <w:pPr>
+        <w:pStyle w:val="ListParagraph"/>
+        <w:numPr>
+          <w:ilvl w:val="0"/>
+          <w:numId w:val="3"/>
+        </w:numPr>
+        <w:spacing w:after="45"/>
+      </w:pPr>
+      <w:r>
+        <w:rPr>
+          <w:sz w:val="19"/>
+          <w:szCs w:val="19"/>
+        </w:rPr>
+        <w:t xml:space="preserve">Select Sync me now or the in-page Sync action.</w:t>
+      </w:r>
+    </w:p>
+    <w:p>
+      <w:pPr>
+        <w:pStyle w:val="ListParagraph"/>
+        <w:numPr>
+          <w:ilvl w:val="0"/>
+          <w:numId w:val="3"/>
+        </w:numPr>
+        <w:spacing w:after="45"/>
+      </w:pPr>
+      <w:r>
+        <w:rPr>
+          <w:sz w:val="19"/>
+          <w:szCs w:val="19"/>
+        </w:rPr>
+        <w:t xml:space="preserve">Wait 10 seconds and compare the visible video time, not only the room timeline.</w:t>
+      </w:r>
+    </w:p>
+    <w:p>
+      <w:pPr>
+        <w:pStyle w:val="ListParagraph"/>
+        <w:numPr>
+          <w:ilvl w:val="0"/>
+          <w:numId w:val="3"/>
+        </w:numPr>
+        <w:spacing w:after="45"/>
+      </w:pPr>
+      <w:r>
+        <w:rPr>
+          <w:sz w:val="19"/>
+          <w:szCs w:val="19"/>
+        </w:rPr>
+        <w:t xml:space="preserve">If it is still frozen, download the detailed report before refreshing.</w:t>
+      </w:r>
+    </w:p>
+    <w:p>
+      <w:pPr>
+        <w:pStyle w:val="ListParagraph"/>
+        <w:numPr>
+          <w:ilvl w:val="0"/>
+          <w:numId w:val="3"/>
+        </w:numPr>
+        <w:spacing w:after="45"/>
+      </w:pPr>
+      <w:r>
+        <w:rPr>
+          <w:sz w:val="19"/>
+          <w:szCs w:val="19"/>
+        </w:rPr>
+        <w:t xml:space="preserve">Refresh only as a separate recovery test and record that a refresh was required.</w:t>
+      </w:r>
+    </w:p>
+    <w:p>
+      <w:pPr>
+        <w:pStyle w:val="Heading1"/>
+        <w:spacing w:after="100" w:before="180"/>
+      </w:pPr>
+      <w:r>
+        <w:rPr>
+          <w:color w:val="0F766E"/>
+        </w:rPr>
+        <w:t xml:space="preserve">15. Record every issue</w:t>
+      </w:r>
+    </w:p>
+    <w:p>
+      <w:pPr>
+        <w:pStyle w:val="ListParagraph"/>
+        <w:numPr>
+          <w:ilvl w:val="0"/>
+          <w:numId w:val="2"/>
+        </w:numPr>
+        <w:spacing w:after="45"/>
+      </w:pPr>
+      <w:r>
+        <w:rPr>
+          <w:sz w:val="19"/>
+          <w:szCs w:val="19"/>
+        </w:rPr>
+        <w:t xml:space="preserve">Test letter and step.</w:t>
+      </w:r>
+    </w:p>
+    <w:p>
+      <w:pPr>
+        <w:pStyle w:val="ListParagraph"/>
+        <w:numPr>
+          <w:ilvl w:val="0"/>
+          <w:numId w:val="2"/>
+        </w:numPr>
+        <w:spacing w:after="45"/>
+      </w:pPr>
+      <w:r>
+        <w:rPr>
+          <w:sz w:val="19"/>
+          <w:szCs w:val="19"/>
+        </w:rPr>
+        <w:t xml:space="preserve">Provider and exact page type.</w:t>
+      </w:r>
+    </w:p>
+    <w:p>
+      <w:pPr>
+        <w:pStyle w:val="ListParagraph"/>
+        <w:numPr>
+          <w:ilvl w:val="0"/>
+          <w:numId w:val="2"/>
+        </w:numPr>
+        <w:spacing w:after="45"/>
+      </w:pPr>
+      <w:r>
+        <w:rPr>
+          <w:sz w:val="19"/>
+          <w:szCs w:val="19"/>
+        </w:rPr>
+        <w:t xml:space="preserve">Host or guest.</w:t>
+      </w:r>
+    </w:p>
+    <w:p>
+      <w:pPr>
+        <w:pStyle w:val="ListParagraph"/>
+        <w:numPr>
+          <w:ilvl w:val="0"/>
+          <w:numId w:val="2"/>
+        </w:numPr>
+        <w:spacing w:after="45"/>
+      </w:pPr>
+      <w:r>
+        <w:rPr>
+          <w:sz w:val="19"/>
+          <w:szCs w:val="19"/>
+        </w:rPr>
+        <w:t xml:space="preserve">Browser and version.</w:t>
+      </w:r>
+    </w:p>
+    <w:p>
+      <w:pPr>
+        <w:pStyle w:val="ListParagraph"/>
+        <w:numPr>
+          <w:ilvl w:val="0"/>
+          <w:numId w:val="2"/>
+        </w:numPr>
+        <w:spacing w:after="45"/>
+      </w:pPr>
+      <w:r>
+        <w:rPr>
+          <w:sz w:val="19"/>
+          <w:szCs w:val="19"/>
+        </w:rPr>
+        <w:t xml:space="preserve">Operating system.</w:t>
+      </w:r>
+    </w:p>
+    <w:p>
+      <w:pPr>
+        <w:pStyle w:val="ListParagraph"/>
+        <w:numPr>
+          <w:ilvl w:val="0"/>
+          <w:numId w:val="2"/>
+        </w:numPr>
+        <w:spacing w:after="45"/>
+      </w:pPr>
+      <w:r>
+        <w:rPr>
+          <w:sz w:val="19"/>
+          <w:szCs w:val="19"/>
+        </w:rPr>
+        <w:t xml:space="preserve">The native video time before and after the control.</w:t>
+      </w:r>
+    </w:p>
+    <w:p>
+      <w:pPr>
+        <w:pStyle w:val="ListParagraph"/>
+        <w:numPr>
+          <w:ilvl w:val="0"/>
+          <w:numId w:val="2"/>
+        </w:numPr>
+        <w:spacing w:after="45"/>
+      </w:pPr>
+      <w:r>
+        <w:rPr>
+          <w:sz w:val="19"/>
+          <w:szCs w:val="19"/>
+        </w:rPr>
+        <w:t xml:space="preserve">Whether new frames visibly rendered after play or seek.</w:t>
+      </w:r>
+    </w:p>
+    <w:p>
+      <w:pPr>
+        <w:pStyle w:val="ListParagraph"/>
+        <w:numPr>
+          <w:ilvl w:val="0"/>
+          <w:numId w:val="2"/>
+        </w:numPr>
+        <w:spacing w:after="45"/>
+      </w:pPr>
+      <w:r>
+        <w:rPr>
+          <w:sz w:val="19"/>
+          <w:szCs w:val="19"/>
+        </w:rPr>
+        <w:t xml:space="preserve">Side-panel status and RTT.</w:t>
+      </w:r>
+    </w:p>
+    <w:p>
+      <w:pPr>
+        <w:pStyle w:val="ListParagraph"/>
+        <w:numPr>
+          <w:ilvl w:val="0"/>
+          <w:numId w:val="2"/>
+        </w:numPr>
+        <w:spacing w:after="45"/>
+      </w:pPr>
+      <w:r>
+        <w:rPr>
+          <w:sz w:val="19"/>
+          <w:szCs w:val="19"/>
+        </w:rPr>
+        <w:t xml:space="preserve">Whether readiness changed unexpectedly.</w:t>
+      </w:r>
+    </w:p>
+    <w:p>
+      <w:pPr>
+        <w:pStyle w:val="ListParagraph"/>
+        <w:numPr>
+          <w:ilvl w:val="0"/>
+          <w:numId w:val="2"/>
+        </w:numPr>
+        <w:spacing w:after="45"/>
+      </w:pPr>
+      <w:r>
+        <w:rPr>
+          <w:sz w:val="19"/>
+          <w:szCs w:val="19"/>
+        </w:rPr>
+        <w:t xml:space="preserve">Whether the room clock moved while the local video was stopped.</w:t>
+      </w:r>
+    </w:p>
+    <w:p>
+      <w:pPr>
+        <w:pStyle w:val="ListParagraph"/>
+        <w:numPr>
+          <w:ilvl w:val="0"/>
+          <w:numId w:val="2"/>
+        </w:numPr>
+        <w:spacing w:after="45"/>
+      </w:pPr>
+      <w:r>
+        <w:rPr>
+          <w:sz w:val="19"/>
+          <w:szCs w:val="19"/>
+        </w:rPr>
+        <w:t xml:space="preserve">Whether a refresh was required.</w:t>
+      </w:r>
+    </w:p>
+    <w:p>
+      <w:pPr>
+        <w:pStyle w:val="ListParagraph"/>
+        <w:numPr>
+          <w:ilvl w:val="0"/>
+          <w:numId w:val="2"/>
+        </w:numPr>
+        <w:spacing w:after="45"/>
+      </w:pPr>
+      <w:r>
+        <w:rPr>
+          <w:sz w:val="19"/>
+          <w:szCs w:val="19"/>
+        </w:rPr>
+        <w:t xml:space="preserve">Detailed-report filename.</w:t>
+      </w:r>
+    </w:p>
+    <w:p>
+      <w:pPr>
+        <w:pStyle w:val="ListParagraph"/>
+        <w:numPr>
+          <w:ilvl w:val="0"/>
+          <w:numId w:val="2"/>
+        </w:numPr>
+        <w:spacing w:after="45"/>
+      </w:pPr>
+      <w:r>
+        <w:rPr>
+          <w:sz w:val="19"/>
+          <w:szCs w:val="19"/>
+        </w:rPr>
+        <w:t xml:space="preserve">A short description without account or payment information.</w:t>
+      </w:r>
+    </w:p>
+    <w:p>
+      <w:pPr>
+        <w:pStyle w:val="Heading1"/>
+        <w:spacing w:after="100" w:before="180"/>
+      </w:pPr>
+      <w:r>
+        <w:rPr>
+          <w:color w:val="0F766E"/>
+        </w:rPr>
+        <w:t xml:space="preserve">16. Pass/fail worksheet</w:t>
       </w:r>
     </w:p>
     <w:tbl>
@@ -3435,6 +5692,188 @@
           </w:p>
         </w:tc>
       </w:tr>
+      <w:tr>
+        <w:tc>
+          <w:tcPr>
+            <w:tcW w:type="dxa" w:w="2400"/>
+            <w:tcBorders>
+              <w:top w:val="single" w:color="D8E3E1" w:sz="2"/>
+              <w:left w:val="single" w:color="D8E3E1" w:sz="2"/>
+              <w:bottom w:val="single" w:color="D8E3E1" w:sz="2"/>
+              <w:right w:val="single" w:color="D8E3E1" w:sz="2"/>
+            </w:tcBorders>
+            <w:shd w:fill="FFFFFF" w:val="clear"/>
+            <w:tcMar>
+              <w:top w:type="dxa" w:w="90"/>
+              <w:left w:type="dxa" w:w="100"/>
+              <w:bottom w:type="dxa" w:w="90"/>
+              <w:right w:type="dxa" w:w="100"/>
+            </w:tcMar>
+          </w:tcPr>
+          <w:p>
+            <w:r>
+              <w:rPr>
+                <w:b w:val="false"/>
+                <w:bCs w:val="false"/>
+                <w:color w:val="24353A"/>
+                <w:sz w:val="17"/>
+                <w:szCs w:val="17"/>
+              </w:rPr>
+              <w:t xml:space="preserve">H. Provider/browser matrix</w:t>
+            </w:r>
+          </w:p>
+        </w:tc>
+        <w:tc>
+          <w:tcPr>
+            <w:tcW w:type="dxa" w:w="1000"/>
+            <w:tcBorders>
+              <w:top w:val="single" w:color="D8E3E1" w:sz="2"/>
+              <w:left w:val="single" w:color="D8E3E1" w:sz="2"/>
+              <w:bottom w:val="single" w:color="D8E3E1" w:sz="2"/>
+              <w:right w:val="single" w:color="D8E3E1" w:sz="2"/>
+            </w:tcBorders>
+            <w:shd w:fill="FFFFFF" w:val="clear"/>
+            <w:tcMar>
+              <w:top w:type="dxa" w:w="90"/>
+              <w:left w:type="dxa" w:w="100"/>
+              <w:bottom w:type="dxa" w:w="90"/>
+              <w:right w:type="dxa" w:w="100"/>
+            </w:tcMar>
+          </w:tcPr>
+          <w:p>
+            <w:r>
+              <w:rPr>
+                <w:b w:val="false"/>
+                <w:bCs w:val="false"/>
+                <w:color w:val="24353A"/>
+                <w:sz w:val="17"/>
+                <w:szCs w:val="17"/>
+              </w:rPr>
+              <w:t xml:space="preserve"> </w:t>
+            </w:r>
+          </w:p>
+        </w:tc>
+        <w:tc>
+          <w:tcPr>
+            <w:tcW w:type="dxa" w:w="1300"/>
+            <w:tcBorders>
+              <w:top w:val="single" w:color="D8E3E1" w:sz="2"/>
+              <w:left w:val="single" w:color="D8E3E1" w:sz="2"/>
+              <w:bottom w:val="single" w:color="D8E3E1" w:sz="2"/>
+              <w:right w:val="single" w:color="D8E3E1" w:sz="2"/>
+            </w:tcBorders>
+            <w:shd w:fill="FFFFFF" w:val="clear"/>
+            <w:tcMar>
+              <w:top w:type="dxa" w:w="90"/>
+              <w:left w:type="dxa" w:w="100"/>
+              <w:bottom w:type="dxa" w:w="90"/>
+              <w:right w:type="dxa" w:w="100"/>
+            </w:tcMar>
+          </w:tcPr>
+          <w:p>
+            <w:r>
+              <w:rPr>
+                <w:b w:val="false"/>
+                <w:bCs w:val="false"/>
+                <w:color w:val="24353A"/>
+                <w:sz w:val="17"/>
+                <w:szCs w:val="17"/>
+              </w:rPr>
+              <w:t xml:space="preserve"> </w:t>
+            </w:r>
+          </w:p>
+        </w:tc>
+        <w:tc>
+          <w:tcPr>
+            <w:tcW w:type="dxa" w:w="900"/>
+            <w:tcBorders>
+              <w:top w:val="single" w:color="D8E3E1" w:sz="2"/>
+              <w:left w:val="single" w:color="D8E3E1" w:sz="2"/>
+              <w:bottom w:val="single" w:color="D8E3E1" w:sz="2"/>
+              <w:right w:val="single" w:color="D8E3E1" w:sz="2"/>
+            </w:tcBorders>
+            <w:shd w:fill="FFFFFF" w:val="clear"/>
+            <w:tcMar>
+              <w:top w:type="dxa" w:w="90"/>
+              <w:left w:type="dxa" w:w="100"/>
+              <w:bottom w:type="dxa" w:w="90"/>
+              <w:right w:type="dxa" w:w="100"/>
+            </w:tcMar>
+          </w:tcPr>
+          <w:p>
+            <w:r>
+              <w:rPr>
+                <w:b w:val="false"/>
+                <w:bCs w:val="false"/>
+                <w:color w:val="24353A"/>
+                <w:sz w:val="17"/>
+                <w:szCs w:val="17"/>
+              </w:rPr>
+              <w:t xml:space="preserve"> </w:t>
+            </w:r>
+          </w:p>
+        </w:tc>
+        <w:tc>
+          <w:tcPr>
+            <w:tcW w:type="dxa" w:w="1700"/>
+            <w:tcBorders>
+              <w:top w:val="single" w:color="D8E3E1" w:sz="2"/>
+              <w:left w:val="single" w:color="D8E3E1" w:sz="2"/>
+              <w:bottom w:val="single" w:color="D8E3E1" w:sz="2"/>
+              <w:right w:val="single" w:color="D8E3E1" w:sz="2"/>
+            </w:tcBorders>
+            <w:shd w:fill="FFFFFF" w:val="clear"/>
+            <w:tcMar>
+              <w:top w:type="dxa" w:w="90"/>
+              <w:left w:type="dxa" w:w="100"/>
+              <w:bottom w:type="dxa" w:w="90"/>
+              <w:right w:type="dxa" w:w="100"/>
+            </w:tcMar>
+          </w:tcPr>
+          <w:p>
+            <w:r>
+              <w:rPr>
+                <w:b w:val="false"/>
+                <w:bCs w:val="false"/>
+                <w:color w:val="24353A"/>
+                <w:sz w:val="17"/>
+                <w:szCs w:val="17"/>
+              </w:rPr>
+              <w:t xml:space="preserve"> </w:t>
+            </w:r>
+          </w:p>
+        </w:tc>
+        <w:tc>
+          <w:tcPr>
+            <w:tcW w:type="dxa" w:w="1700"/>
+            <w:tcBorders>
+              <w:top w:val="single" w:color="D8E3E1" w:sz="2"/>
+              <w:left w:val="single" w:color="D8E3E1" w:sz="2"/>
+              <w:bottom w:val="single" w:color="D8E3E1" w:sz="2"/>
+              <w:right w:val="single" w:color="D8E3E1" w:sz="2"/>
+            </w:tcBorders>
+            <w:shd w:fill="FFFFFF" w:val="clear"/>
+            <w:tcMar>
+              <w:top w:type="dxa" w:w="90"/>
+              <w:left w:type="dxa" w:w="100"/>
+              <w:bottom w:type="dxa" w:w="90"/>
+              <w:right w:type="dxa" w:w="100"/>
+            </w:tcMar>
+          </w:tcPr>
+          <w:p>
+            <w:r>
+              <w:rPr>
+                <w:b w:val="false"/>
+                <w:bCs w:val="false"/>
+                <w:color w:val="24353A"/>
+                <w:sz w:val="17"/>
+                <w:szCs w:val="17"/>
+              </w:rPr>
+              <w:t xml:space="preserve"> </w:t>
+            </w:r>
+          </w:p>
+        </w:tc>
+      </w:tr>
     </w:tbl>
     <w:p>
       <w:pPr>
@@ -3445,7 +5884,7 @@
         <w:rPr>
           <w:color w:val="0F766E"/>
         </w:rPr>
-        <w:t xml:space="preserve">14. Release-blocking outcomes</w:t>
+        <w:t xml:space="preserve">17. Release-blocking outcomes</w:t>
       </w:r>
     </w:p>
     <w:p>

</xml_diff>